<commit_message>
Local work and writing
</commit_message>
<xml_diff>
--- a/Working Documents/2026_COMPAAPM_Abstract.docx
+++ b/Working Documents/2026_COMPAAPM_Abstract.docx
@@ -47,65 +47,12 @@
       </w:r>
     </w:p>
     <w:p>
-      <w:pPr>
-        <w:numPr>
-          <w:ilvl w:val="0"/>
-          <w:numId w:val="2"/>
-        </w:numPr>
-      </w:pPr>
-      <w:r>
-        <w:t>Any abstract that does </w:t>
-      </w:r>
       <w:r>
         <w:rPr>
           <w:b/>
           <w:bCs/>
         </w:rPr>
-        <w:t>NOT</w:t>
-      </w:r>
-      <w:r>
-        <w:t> conform with this structured format </w:t>
-      </w:r>
-      <w:hyperlink r:id="rId6" w:tgtFrame="_blank" w:history="1">
-        <w:r>
-          <w:rPr>
-            <w:rStyle w:val="Hyperlink"/>
-          </w:rPr>
-          <w:t>(refer to Sample Abstract)</w:t>
-        </w:r>
-      </w:hyperlink>
-      <w:r>
-        <w:t> will be </w:t>
-      </w:r>
-      <w:r>
-        <w:rPr>
-          <w:b/>
-          <w:bCs/>
-        </w:rPr>
-        <w:t>REJECTED</w:t>
-      </w:r>
-      <w:r>
-        <w:t>. </w:t>
-      </w:r>
-      <w:r>
-        <w:rPr>
-          <w:b/>
-          <w:bCs/>
-        </w:rPr>
-        <w:t>Prior to finalizing your submission, confirm that your abstract follows the required format exactly.</w:t>
-      </w:r>
-      <w:r>
-        <w:t> The Abstract text </w:t>
-      </w:r>
-      <w:r>
-        <w:rPr>
-          <w:b/>
-          <w:bCs/>
-        </w:rPr>
-        <w:t>MUST</w:t>
-      </w:r>
-      <w:r>
-        <w:t> be structured as follows:</w:t>
+        <w:t>ABSTRACT</w:t>
       </w:r>
     </w:p>
     <w:p>
@@ -136,10 +83,28 @@
         <w:t xml:space="preserve">Total Body Irradiation </w:t>
       </w:r>
       <w:r>
-        <w:t xml:space="preserve">(TBI) </w:t>
-      </w:r>
-      <w:r>
-        <w:t>as well as determining the maximum and minimum absolute dose to the blood.</w:t>
+        <w:t>(TBI</w:t>
+      </w:r>
+      <w:r>
+        <w:t>)</w:t>
+      </w:r>
+      <w:r>
+        <w:t>, a full body blood flow simulation</w:t>
+      </w:r>
+      <w:r>
+        <w:t xml:space="preserve"> </w:t>
+      </w:r>
+      <w:r>
+        <w:t>was combined with a 4-dimensional Monte Carlo (4DMC)</w:t>
+      </w:r>
+      <w:r>
+        <w:t xml:space="preserve"> simulation.</w:t>
+      </w:r>
+      <w:r>
+        <w:t xml:space="preserve"> Additionally</w:t>
+      </w:r>
+      <w:r>
+        <w:t xml:space="preserve"> maximum and minimum dose to the blood and the dose rate to the lungs was determined as they are clinically relevant parameters.</w:t>
       </w:r>
       <w:r>
         <w:rPr>
@@ -157,11 +122,40 @@
         <w:t xml:space="preserve"> </w:t>
       </w:r>
       <w:r>
-        <w:t xml:space="preserve"> A virtual phantom was used to create a blood flow model which enabled the</w:t>
+        <w:t xml:space="preserve"> A virtual phantom </w:t>
+      </w:r>
+      <w:r>
+        <w:t xml:space="preserve">was used to replicate a Co-60 TBI treatment set-up for time-resolved Monte Carlo simulations using in-house modified </w:t>
+      </w:r>
+      <w:proofErr w:type="spellStart"/>
+      <w:r>
+        <w:t>EGSnrc</w:t>
+      </w:r>
+      <w:proofErr w:type="spellEnd"/>
+      <w:r>
+        <w:t>, referred to as 4DMC. A single fraction was simulated.</w:t>
       </w:r>
       <w:r>
         <w:t xml:space="preserve"> </w:t>
       </w:r>
+      <w:r>
+        <w:t xml:space="preserve">The phantom was also enabled the </w:t>
+      </w:r>
+      <w:r>
+        <w:t>creat</w:t>
+      </w:r>
+      <w:r>
+        <w:t>ion of a</w:t>
+      </w:r>
+      <w:r>
+        <w:t xml:space="preserve"> blood flow model </w:t>
+      </w:r>
+      <w:r>
+        <w:t>to</w:t>
+      </w:r>
+      <w:r>
+        <w:t xml:space="preserve"> </w:t>
+      </w:r>
       <w:proofErr w:type="spellStart"/>
       <w:r>
         <w:t>spatio</w:t>
@@ -171,7 +165,16 @@
         <w:t>-temporal</w:t>
       </w:r>
       <w:r>
-        <w:t xml:space="preserve"> tracking of blood volumes (BVs) throughout the phanto</w:t>
+        <w:t>ly</w:t>
+      </w:r>
+      <w:r>
+        <w:t xml:space="preserve"> </w:t>
+      </w:r>
+      <w:r>
+        <w:t xml:space="preserve">track </w:t>
+      </w:r>
+      <w:r>
+        <w:t>blood volumes (BVs) throughout the phanto</w:t>
       </w:r>
       <w:r>
         <w:t>m</w:t>
@@ -180,60 +183,65 @@
         <w:t>.</w:t>
       </w:r>
       <w:r>
-        <w:t xml:space="preserve"> # major vessels and # tissue and organ compartments comprise the model. BV trajectories were determined using one-dimensional blood flow modeling, in-vivo data and compartment models. </w:t>
-      </w:r>
-      <w:r>
-        <w:t>Additionally</w:t>
-      </w:r>
-      <w:r>
-        <w:t xml:space="preserve">, the phantom was used to replicate </w:t>
-      </w:r>
-      <w:r>
-        <w:t>a</w:t>
-      </w:r>
-      <w:r>
         <w:t xml:space="preserve"> </w:t>
       </w:r>
       <w:r>
-        <w:t>Co-60 TBI treatment set-up</w:t>
+        <w:t xml:space="preserve">The model is composed of 94 vessel segments and 28 compartments.  </w:t>
+      </w:r>
+      <w:r>
+        <w:t>BV trajectories were determined using one-dimensional blood flow modeling, in-vivo data</w:t>
       </w:r>
       <w:r>
         <w:t>,</w:t>
       </w:r>
       <w:r>
-        <w:t xml:space="preserve"> enabl</w:t>
-      </w:r>
-      <w:r>
-        <w:t>ing</w:t>
-      </w:r>
-      <w:r>
-        <w:t xml:space="preserve"> time-resolved Monte Carlo (MC) simulations using in-house modified </w:t>
+        <w:t xml:space="preserve"> and </w:t>
+      </w:r>
+      <w:r>
+        <w:t>zero-dimensional compartments</w:t>
+      </w:r>
+      <w:r>
+        <w:t xml:space="preserve">. </w:t>
+      </w:r>
+      <w:r>
+        <w:t>The dose data from the 4DMC simulation w</w:t>
+      </w:r>
+      <w:r>
+        <w:t>as</w:t>
+      </w:r>
+      <w:r>
+        <w:t xml:space="preserve"> sampled </w:t>
+      </w:r>
+      <w:r>
+        <w:t xml:space="preserve">as </w:t>
+      </w:r>
+      <w:r>
+        <w:t>1E5</w:t>
+      </w:r>
+      <w:r>
+        <w:t xml:space="preserve"> BVs moved through the </w:t>
+      </w:r>
+      <w:r>
+        <w:t xml:space="preserve">flow model with a time resolution of 2 </w:t>
       </w:r>
       <w:proofErr w:type="spellStart"/>
       <w:r>
-        <w:t>EGSnrc</w:t>
+        <w:t>ms.</w:t>
       </w:r>
       <w:proofErr w:type="spellEnd"/>
       <w:r>
-        <w:t xml:space="preserve">, referred to as 4DMC. </w:t>
-      </w:r>
-      <w:r>
-        <w:t xml:space="preserve">With 4DMC the real-time dose rates are used to determine the dose within the </w:t>
-      </w:r>
-      <w:proofErr w:type="spellStart"/>
-      <w:r>
-        <w:t>comaprtments</w:t>
-      </w:r>
-      <w:proofErr w:type="spellEnd"/>
-      <w:r>
-        <w:t xml:space="preserve"> and the </w:t>
-      </w:r>
+        <w:t xml:space="preserve"> </w:t>
+      </w:r>
+      <w:r>
+        <w:t xml:space="preserve"> </w:t>
+      </w:r>
+    </w:p>
+    <w:p>
       <w:r>
         <w:rPr>
           <w:b/>
           <w:bCs/>
         </w:rPr>
-        <w:br/>
         <w:t>Results</w:t>
       </w:r>
       <w:r>
@@ -247,7 +255,13 @@
         <w:t xml:space="preserve"> The circulating blood received </w:t>
       </w:r>
       <w:r>
-        <w:t># in one fraction. Compared to results in literature ####</w:t>
+        <w:t xml:space="preserve"># in one fraction. </w:t>
+      </w:r>
+      <w:r>
+        <w:t xml:space="preserve">The maximum dose over </w:t>
+      </w:r>
+      <w:r>
+        <w:t>Compared to results in literature ####</w:t>
       </w:r>
       <w:r>
         <w:rPr>
@@ -268,10 +282,40 @@
         <w:t>A novel whole-body blood flow</w:t>
       </w:r>
       <w:r>
-        <w:t xml:space="preserve"> model was developed to enable </w:t>
-      </w:r>
-      <w:r>
-        <w:t>the</w:t>
+        <w:t xml:space="preserve"> model </w:t>
+      </w:r>
+      <w:r>
+        <w:t xml:space="preserve">was paired with the a 4DMC simulation of sweeping Co-60 TBI to demonstrate that </w:t>
+      </w:r>
+    </w:p>
+    <w:p>
+      <w:r>
+        <w:t>“</w:t>
+      </w:r>
+      <w:r>
+        <w:t>. The preliminary results of a retrospective study using this technique on patients who have received TBI at our clinic indicate that, for a total body prescription dose of 12 Gy ± 10%,</w:t>
+      </w:r>
+      <w:r>
+        <w:t>”</w:t>
+      </w:r>
+    </w:p>
+    <w:p>
+      <w:r>
+        <w:t>“</w:t>
+      </w:r>
+      <w:r>
+        <w:t xml:space="preserve">This high-quality dose data shows promise for use in both routine quality assurance of our current technique, and to provide baseline data for development of a new technique. The technique could also be adapted to TBI techniques at other clinics that include compensators, f </w:t>
+      </w:r>
+      <w:proofErr w:type="spellStart"/>
+      <w:r>
+        <w:t>lattening</w:t>
+      </w:r>
+      <w:proofErr w:type="spellEnd"/>
+      <w:r>
+        <w:t xml:space="preserve"> filters, moving beams, and/or multiple treatment positions.</w:t>
+      </w:r>
+      <w:r>
+        <w:t>”</w:t>
       </w:r>
     </w:p>
     <w:p>
@@ -283,60 +327,6 @@
       </w:pPr>
       <w:r>
         <w:t>Abstracts must NOT exceed 300 words.</w:t>
-      </w:r>
-    </w:p>
-    <w:p>
-      <w:pPr>
-        <w:numPr>
-          <w:ilvl w:val="1"/>
-          <w:numId w:val="3"/>
-        </w:numPr>
-      </w:pPr>
-      <w:r>
-        <w:t>Enter Abstract text directly in the designated field in the system. If you Copy/Paste, be sure to proofread the integrity of the text. </w:t>
-      </w:r>
-      <w:r>
-        <w:rPr>
-          <w:b/>
-          <w:bCs/>
-        </w:rPr>
-        <w:t>The abstract entry field is text only and does not support symbols or equations except those shown in the table.</w:t>
-      </w:r>
-    </w:p>
-    <w:p>
-      <w:pPr>
-        <w:numPr>
-          <w:ilvl w:val="1"/>
-          <w:numId w:val="3"/>
-        </w:numPr>
-      </w:pPr>
-      <w:r>
-        <w:rPr>
-          <w:b/>
-          <w:bCs/>
-        </w:rPr>
-        <w:t>DO NOT </w:t>
-      </w:r>
-      <w:r>
-        <w:t>include Title, Author names/institutions, graphs, figures, tables, images, or multimedia elements. Titles and Author information is entered elsewhere in the system and will be merged with the abstract file later in the process.</w:t>
-      </w:r>
-    </w:p>
-    <w:p>
-      <w:pPr>
-        <w:numPr>
-          <w:ilvl w:val="1"/>
-          <w:numId w:val="3"/>
-        </w:numPr>
-      </w:pPr>
-      <w:r>
-        <w:rPr>
-          <w:b/>
-          <w:bCs/>
-        </w:rPr>
-        <w:t>DO NOT </w:t>
-      </w:r>
-      <w:r>
-        <w:t>refer to material in the Supporting Document in the Abstract since the former will not be published together with the latter.</w:t>
       </w:r>
     </w:p>
     <w:p/>
@@ -787,7 +777,7 @@
       <w:r>
         <w:t>Preferred format is illustrated in the </w:t>
       </w:r>
-      <w:hyperlink r:id="rId7" w:history="1">
+      <w:hyperlink r:id="rId6" w:history="1">
         <w:r>
           <w:rPr>
             <w:rStyle w:val="Hyperlink"/>
@@ -853,7 +843,7 @@
                     <pic:cNvPicPr/>
                   </pic:nvPicPr>
                   <pic:blipFill>
-                    <a:blip r:embed="rId8"/>
+                    <a:blip r:embed="rId7"/>
                     <a:stretch>
                       <a:fillRect/>
                     </a:stretch>

</xml_diff>

<commit_message>
Re sampling compartment dose data.
</commit_message>
<xml_diff>
--- a/Working Documents/2026_COMPAAPM_Abstract.docx
+++ b/Working Documents/2026_COMPAAPM_Abstract.docx
@@ -10,6 +10,20 @@
         </w:rPr>
         <w:t>TITLE</w:t>
       </w:r>
+      <w:r>
+        <w:rPr>
+          <w:b/>
+          <w:bCs/>
+        </w:rPr>
+        <w:t xml:space="preserve">: </w:t>
+      </w:r>
+      <w:r>
+        <w:rPr>
+          <w:b/>
+          <w:bCs/>
+        </w:rPr>
+        <w:t>Assessing the Homogeneity of Dose Delivered to Blood During Sweeping Cobalt-60 Total Body Irradiation</w:t>
+      </w:r>
     </w:p>
     <w:p>
       <w:r>
@@ -34,7 +48,7 @@
           <w:numId w:val="1"/>
         </w:numPr>
       </w:pPr>
-      <w:hyperlink r:id="rId5" w:tgtFrame="_blank" w:history="1">
+      <w:hyperlink r:id="rId6" w:tgtFrame="_blank" w:history="1">
         <w:r>
           <w:rPr>
             <w:rStyle w:val="Hyperlink"/>
@@ -54,6 +68,34 @@
         </w:rPr>
         <w:t>ABSTRACT</w:t>
       </w:r>
+      <w:r>
+        <w:rPr>
+          <w:b/>
+          <w:bCs/>
+        </w:rPr>
+        <w:t xml:space="preserve"> (2</w:t>
+      </w:r>
+      <w:r>
+        <w:rPr>
+          <w:b/>
+          <w:bCs/>
+        </w:rPr>
+        <w:t>5</w:t>
+      </w:r>
+      <w:r>
+        <w:rPr>
+          <w:b/>
+          <w:bCs/>
+        </w:rPr>
+        <w:t>8</w:t>
+      </w:r>
+      <w:r>
+        <w:rPr>
+          <w:b/>
+          <w:bCs/>
+        </w:rPr>
+        <w:t>/300 words)</w:t>
+      </w:r>
     </w:p>
     <w:p>
       <w:r>
@@ -71,10 +113,19 @@
         <w:t xml:space="preserve">  </w:t>
       </w:r>
       <w:r>
-        <w:t xml:space="preserve">To assess the homogeneity of dose delivered to </w:t>
-      </w:r>
-      <w:r>
-        <w:t xml:space="preserve">the circulating blood volume during Sweeping Cobalt-60 </w:t>
+        <w:t xml:space="preserve">Total body irradiation requires the entirety of the patient's body to be irradiated, and treatment methods vary greatly across treatment centres. For many of these techniques, little is known about the heterogeneity of dose delivered to the circulating blood. </w:t>
+      </w:r>
+      <w:r>
+        <w:t xml:space="preserve">To assess the dose delivered to </w:t>
+      </w:r>
+      <w:r>
+        <w:t>the circulating blood volume</w:t>
+      </w:r>
+      <w:r>
+        <w:t>s (BVs)</w:t>
+      </w:r>
+      <w:r>
+        <w:t xml:space="preserve"> during Sweeping Cobalt-60 </w:t>
       </w:r>
       <w:r>
         <w:t xml:space="preserve">(Co-60) </w:t>
@@ -95,17 +146,36 @@
         <w:t xml:space="preserve"> </w:t>
       </w:r>
       <w:r>
-        <w:t>was combined with a 4-dimensional Monte Carlo (4DMC)</w:t>
-      </w:r>
-      <w:r>
-        <w:t xml:space="preserve"> simulation.</w:t>
-      </w:r>
-      <w:r>
-        <w:t xml:space="preserve"> Additionally</w:t>
-      </w:r>
-      <w:r>
+        <w:t>was combined with 4-dimensional Monte Carlo (4DMC)</w:t>
+      </w:r>
+      <w:r>
+        <w:t xml:space="preserve"> simulation</w:t>
+      </w:r>
+      <w:r>
+        <w:t>s</w:t>
+      </w:r>
+      <w:r>
+        <w:t>.</w:t>
+      </w:r>
+    </w:p>
+    <w:p>
+      <w:r>
+        <w:t xml:space="preserve"> </w:t>
+      </w:r>
+      <w:r>
+        <w:rPr>
+          <w:highlight w:val="lightGray"/>
+        </w:rPr>
+        <w:t>Additionally</w:t>
+      </w:r>
+      <w:r>
+        <w:rPr>
+          <w:highlight w:val="lightGray"/>
+        </w:rPr>
         <w:t xml:space="preserve"> maximum and minimum dose to the blood and the dose rate to the lungs was determined as they are clinically relevant parameters.</w:t>
       </w:r>
+    </w:p>
+    <w:p>
       <w:r>
         <w:rPr>
           <w:b/>
@@ -125,7 +195,10 @@
         <w:t xml:space="preserve"> A virtual phantom </w:t>
       </w:r>
       <w:r>
-        <w:t xml:space="preserve">was used to replicate a Co-60 TBI treatment set-up for time-resolved Monte Carlo simulations using in-house modified </w:t>
+        <w:t>was used to replicate a Co-60 TBI treatment set-up</w:t>
+      </w:r>
+      <w:r>
+        <w:t xml:space="preserve"> for </w:t>
       </w:r>
       <w:proofErr w:type="spellStart"/>
       <w:r>
@@ -133,13 +206,57 @@
       </w:r>
       <w:proofErr w:type="spellEnd"/>
       <w:r>
-        <w:t>, referred to as 4DMC. A single fraction was simulated.</w:t>
+        <w:t xml:space="preserve"> MC simulations</w:t>
+      </w:r>
+      <w:r>
+        <w:t xml:space="preserve">. </w:t>
       </w:r>
       <w:r>
         <w:t xml:space="preserve"> </w:t>
       </w:r>
       <w:r>
-        <w:t xml:space="preserve">The phantom was also enabled the </w:t>
+        <w:t>T</w:t>
+      </w:r>
+      <w:r>
+        <w:t xml:space="preserve">ime-resolved Monte Carlo simulations using in-house modified </w:t>
+      </w:r>
+      <w:proofErr w:type="spellStart"/>
+      <w:r>
+        <w:t>DOSXYZnrc</w:t>
+      </w:r>
+      <w:proofErr w:type="spellEnd"/>
+      <w:r>
+        <w:t>, referred to as 4DMC</w:t>
+      </w:r>
+      <w:r>
+        <w:t>,</w:t>
+      </w:r>
+      <w:r>
+        <w:t xml:space="preserve"> for</w:t>
+      </w:r>
+      <w:r>
+        <w:t xml:space="preserve"> </w:t>
+      </w:r>
+      <w:r>
+        <w:t xml:space="preserve">a </w:t>
+      </w:r>
+      <w:r>
+        <w:t>single fraction w</w:t>
+      </w:r>
+      <w:r>
+        <w:t xml:space="preserve">ere </w:t>
+      </w:r>
+      <w:r>
+        <w:t>completed</w:t>
+      </w:r>
+      <w:r>
+        <w:t>.</w:t>
+      </w:r>
+      <w:r>
+        <w:t xml:space="preserve"> </w:t>
+      </w:r>
+      <w:r>
+        <w:t xml:space="preserve">The phantom also enabled the </w:t>
       </w:r>
       <w:r>
         <w:t>creat</w:t>
@@ -162,10 +279,7 @@
       </w:r>
       <w:proofErr w:type="spellEnd"/>
       <w:r>
-        <w:t>-temporal</w:t>
-      </w:r>
-      <w:r>
-        <w:t>ly</w:t>
+        <w:t>-temporally</w:t>
       </w:r>
       <w:r>
         <w:t xml:space="preserve"> </w:t>
@@ -174,7 +288,7 @@
         <w:t xml:space="preserve">track </w:t>
       </w:r>
       <w:r>
-        <w:t>blood volumes (BVs) throughout the phanto</w:t>
+        <w:t>BVs throughout the phanto</w:t>
       </w:r>
       <w:r>
         <w:t>m</w:t>
@@ -204,10 +318,16 @@
         <w:t xml:space="preserve">. </w:t>
       </w:r>
       <w:r>
-        <w:t>The dose data from the 4DMC simulation w</w:t>
-      </w:r>
-      <w:r>
-        <w:t>as</w:t>
+        <w:t>The dose data from the 4DMC simulation</w:t>
+      </w:r>
+      <w:r>
+        <w:t>s</w:t>
+      </w:r>
+      <w:r>
+        <w:t xml:space="preserve"> w</w:t>
+      </w:r>
+      <w:r>
+        <w:t>ere</w:t>
       </w:r>
       <w:r>
         <w:t xml:space="preserve"> sampled </w:t>
@@ -226,14 +346,11 @@
       </w:r>
       <w:proofErr w:type="spellStart"/>
       <w:r>
-        <w:t>ms.</w:t>
+        <w:t>ms</w:t>
       </w:r>
       <w:proofErr w:type="spellEnd"/>
       <w:r>
-        <w:t xml:space="preserve"> </w:t>
-      </w:r>
-      <w:r>
-        <w:t xml:space="preserve"> </w:t>
+        <w:t xml:space="preserve"> to determine the dose to the BVs. </w:t>
       </w:r>
     </w:p>
     <w:p>
@@ -255,20 +372,36 @@
         <w:t xml:space="preserve"> The circulating blood received </w:t>
       </w:r>
       <w:r>
-        <w:t xml:space="preserve"># in one fraction. </w:t>
-      </w:r>
-      <w:r>
-        <w:t xml:space="preserve">The maximum dose over </w:t>
-      </w:r>
-      <w:r>
-        <w:t>Compared to results in literature ####</w:t>
-      </w:r>
+        <w:t># +- # %</w:t>
+      </w:r>
+      <w:r>
+        <w:t xml:space="preserve"> in one fraction</w:t>
+      </w:r>
+      <w:r>
+        <w:t>.</w:t>
+      </w:r>
+      <w:r>
+        <w:t xml:space="preserve"> The integration of motion </w:t>
+      </w:r>
+      <w:r>
+        <w:rPr>
+          <w:highlight w:val="lightGray"/>
+        </w:rPr>
+        <w:t>results of comparting static to moving</w:t>
+      </w:r>
+      <w:r>
+        <w:t>.</w:t>
+      </w:r>
+      <w:r>
+        <w:t xml:space="preserve"> The </w:t>
+      </w:r>
+    </w:p>
+    <w:p>
       <w:r>
         <w:rPr>
           <w:b/>
           <w:bCs/>
         </w:rPr>
-        <w:br/>
         <w:t>Conclusion:</w:t>
       </w:r>
       <w:r>
@@ -285,37 +418,10 @@
         <w:t xml:space="preserve"> model </w:t>
       </w:r>
       <w:r>
-        <w:t xml:space="preserve">was paired with the a 4DMC simulation of sweeping Co-60 TBI to demonstrate that </w:t>
-      </w:r>
-    </w:p>
-    <w:p>
-      <w:r>
-        <w:t>“</w:t>
-      </w:r>
-      <w:r>
-        <w:t>. The preliminary results of a retrospective study using this technique on patients who have received TBI at our clinic indicate that, for a total body prescription dose of 12 Gy ± 10%,</w:t>
-      </w:r>
-      <w:r>
-        <w:t>”</w:t>
-      </w:r>
-    </w:p>
-    <w:p>
-      <w:r>
-        <w:t>“</w:t>
-      </w:r>
-      <w:r>
-        <w:t xml:space="preserve">This high-quality dose data shows promise for use in both routine quality assurance of our current technique, and to provide baseline data for development of a new technique. The technique could also be adapted to TBI techniques at other clinics that include compensators, f </w:t>
-      </w:r>
-      <w:proofErr w:type="spellStart"/>
-      <w:r>
-        <w:t>lattening</w:t>
-      </w:r>
-      <w:proofErr w:type="spellEnd"/>
-      <w:r>
-        <w:t xml:space="preserve"> filters, moving beams, and/or multiple treatment positions.</w:t>
-      </w:r>
-      <w:r>
-        <w:t>”</w:t>
+        <w:t xml:space="preserve">was paired with 4DMC simulation of sweeping Co-60 TBI to </w:t>
+      </w:r>
+      <w:r>
+        <w:t xml:space="preserve">assess the heterogeneity of the dose to the circulating blood. </w:t>
       </w:r>
     </w:p>
     <w:p>
@@ -330,225 +436,19 @@
       </w:r>
     </w:p>
     <w:p/>
+    <w:p/>
+    <w:p/>
     <w:p>
       <w:r>
-        <w:rPr>
-          <w:b/>
-          <w:bCs/>
-        </w:rPr>
-        <w:t>Purpose:</w:t>
-      </w:r>
-      <w:r>
-        <w:t xml:space="preserve"> In radiotherapy and medical imaging, motion of the radiation source, detector device and the radiation target are typically part of the treatment or imaging technique. To enable the Monte Carlo modelling of the effect of dynamic components, consideration of the time domain was incorporated into </w:t>
-      </w:r>
-      <w:proofErr w:type="spellStart"/>
-      <w:r>
-        <w:t>EGSnrc</w:t>
-      </w:r>
-      <w:proofErr w:type="spellEnd"/>
-      <w:r>
-        <w:t>. This allows for arbitrary, continuous motion of geometries, chronological simulation observation, and synchronization of simulation elements.</w:t>
+        <w:br/>
       </w:r>
     </w:p>
+    <w:p/>
+    <w:p/>
+    <w:p/>
     <w:p>
       <w:r>
-        <w:rPr>
-          <w:b/>
-          <w:bCs/>
-        </w:rPr>
-        <w:lastRenderedPageBreak/>
-        <w:t>Methods:</w:t>
-      </w:r>
-      <w:r>
-        <w:t xml:space="preserve"> The C++ class library </w:t>
-      </w:r>
-      <w:proofErr w:type="spellStart"/>
-      <w:r>
-        <w:t>egs</w:t>
-      </w:r>
-      <w:proofErr w:type="spellEnd"/>
-      <w:r>
-        <w:t xml:space="preserve">++ was modified in </w:t>
-      </w:r>
-      <w:proofErr w:type="spellStart"/>
-      <w:r>
-        <w:t>EGSnrc</w:t>
-      </w:r>
-      <w:proofErr w:type="spellEnd"/>
-      <w:r>
-        <w:t xml:space="preserve"> to include a time index as a particle-specific quantity. A new feature was added that introduces motion for any geometry object, allowing for arbitrary time-dependent translations and rotations. Support was added for synchronized motion of particle sources, and recording particle tracks with time indices for 4-D visualization. The </w:t>
-      </w:r>
-      <w:proofErr w:type="spellStart"/>
-      <w:r>
-        <w:t>egs_view</w:t>
-      </w:r>
-      <w:proofErr w:type="spellEnd"/>
-      <w:r>
-        <w:t xml:space="preserve"> 3-D visualization tool was modified to include time evolution and inspection of tracks within time windows.</w:t>
-      </w:r>
-    </w:p>
-    <w:p>
-      <w:r>
-        <w:rPr>
-          <w:b/>
-          <w:bCs/>
-        </w:rPr>
-        <w:t>Results:</w:t>
-      </w:r>
-      <w:r>
-        <w:t> The simulation results of cumulative quantities after simulation of dynamic motion were investigated for a range of cases. Tests of validity passed at the appropriate level. It’s worth noting that uniform generation of source particles over the time range can lead to statistical uncertainty considerations when the simulation includes variable-speed motion.</w:t>
-      </w:r>
-      <w:r>
         <w:br/>
-      </w:r>
-      <w:r>
-        <w:br/>
-      </w:r>
-      <w:r>
-        <w:rPr>
-          <w:b/>
-          <w:bCs/>
-        </w:rPr>
-        <w:t>Conclusions:</w:t>
-      </w:r>
-      <w:r>
-        <w:t xml:space="preserve"> Generalized 4-D simulations including complex geometrical and source motion have been implemented in </w:t>
-      </w:r>
-      <w:proofErr w:type="spellStart"/>
-      <w:r>
-        <w:t>EGSnrc</w:t>
-      </w:r>
-      <w:proofErr w:type="spellEnd"/>
-      <w:r>
-        <w:t>. This provides valuable new functionality for the modelling of modern radiotherapy, radiation imaging and related technologies.</w:t>
-      </w:r>
-    </w:p>
-    <w:p>
-      <w:r>
-        <w:rPr>
-          <w:b/>
-          <w:bCs/>
-        </w:rPr>
-        <w:t>Purpose:</w:t>
-      </w:r>
-      <w:r>
-        <w:t xml:space="preserve"> The purpose of this research is to validate the phase space data for a 4MV flattening filter free (FFF) beam generated with Varian’s </w:t>
-      </w:r>
-      <w:proofErr w:type="spellStart"/>
-      <w:r>
-        <w:t>VirtuaLinac</w:t>
-      </w:r>
-      <w:proofErr w:type="spellEnd"/>
-      <w:r>
-        <w:t xml:space="preserve"> simulation engine by comparing with measurements.</w:t>
-      </w:r>
-    </w:p>
-    <w:p>
-      <w:r>
-        <w:rPr>
-          <w:b/>
-          <w:bCs/>
-        </w:rPr>
-        <w:t>Methods:</w:t>
-      </w:r>
-      <w:r>
-        <w:t xml:space="preserve"> TrueBeam 4MV FFF phase space was simulated using </w:t>
-      </w:r>
-      <w:proofErr w:type="spellStart"/>
-      <w:r>
-        <w:t>VirtuaLinac</w:t>
-      </w:r>
-      <w:proofErr w:type="spellEnd"/>
-      <w:r>
-        <w:t xml:space="preserve">, a Monte Carlo linac head simulation package developed by Varian Medical Systems. </w:t>
-      </w:r>
-      <w:proofErr w:type="spellStart"/>
-      <w:r>
-        <w:t>VirtuaLinac</w:t>
-      </w:r>
-      <w:proofErr w:type="spellEnd"/>
-      <w:r>
-        <w:t xml:space="preserve"> is based on Geant4 and simulates the treatment head by incorporating a detailed model of the linac based on manufacturer’s drawings. The phase space from the simulation was recorded immediately upstream of the linac jaws and used as a virtual source in the subsequent simulation with </w:t>
-      </w:r>
-      <w:proofErr w:type="spellStart"/>
-      <w:r>
-        <w:t>BEAMnrc</w:t>
-      </w:r>
-      <w:proofErr w:type="spellEnd"/>
-      <w:r>
-        <w:t xml:space="preserve"> and </w:t>
-      </w:r>
-      <w:proofErr w:type="spellStart"/>
-      <w:r>
-        <w:t>DOSXYZnrc</w:t>
-      </w:r>
-      <w:proofErr w:type="spellEnd"/>
-      <w:r>
-        <w:t xml:space="preserve">. </w:t>
-      </w:r>
-      <w:proofErr w:type="spellStart"/>
-      <w:r>
-        <w:t>BEAMnrc</w:t>
-      </w:r>
-      <w:proofErr w:type="spellEnd"/>
-      <w:r>
-        <w:t xml:space="preserve"> was used to simulate the linac head below the monitor chamber, and </w:t>
-      </w:r>
-      <w:proofErr w:type="spellStart"/>
-      <w:r>
-        <w:t>DOSXYZnrc</w:t>
-      </w:r>
-      <w:proofErr w:type="spellEnd"/>
-      <w:r>
-        <w:t xml:space="preserve"> was used for phantom dose calculations. Dose calculations in a water phantom were performed for fields ranging from 3x3 cm2 to 30x30 cm2. Percent depth doses (PDDs), transverse profiles and output factors were calculated and compared with ion chamber measurements for all fields measured.</w:t>
-      </w:r>
-    </w:p>
-    <w:p>
-      <w:r>
-        <w:rPr>
-          <w:b/>
-          <w:bCs/>
-        </w:rPr>
-        <w:t>Results:</w:t>
-      </w:r>
-      <w:r>
-        <w:t> Monte Carlo simulations and measurements agreed within 1.5% for PDDs in the regions excluding the buildup, and within 2.0% for transverse profiles excluding the penumbra region. The agreement between calculated and measured output factors was within 0.6%. These results indicate that the 4 MV FFF phase space data is sufficiently accurate for use in dose calculation.</w:t>
-      </w:r>
-    </w:p>
-    <w:p>
-      <w:r>
-        <w:rPr>
-          <w:b/>
-          <w:bCs/>
-        </w:rPr>
-        <w:t>Conclusion:</w:t>
-      </w:r>
-      <w:r>
-        <w:t xml:space="preserve"> We have demonstrated the feasibility of using Varian’s cloud-based Monte Caro linac simulator </w:t>
-      </w:r>
-      <w:proofErr w:type="spellStart"/>
-      <w:r>
-        <w:t>VirtuaLinac</w:t>
-      </w:r>
-      <w:proofErr w:type="spellEnd"/>
-      <w:r>
-        <w:t xml:space="preserve"> with </w:t>
-      </w:r>
-      <w:proofErr w:type="spellStart"/>
-      <w:r>
-        <w:t>BEAMnrc</w:t>
-      </w:r>
-      <w:proofErr w:type="spellEnd"/>
-      <w:r>
-        <w:t xml:space="preserve"> and </w:t>
-      </w:r>
-      <w:proofErr w:type="spellStart"/>
-      <w:r>
-        <w:t>DOSXYZnrc</w:t>
-      </w:r>
-      <w:proofErr w:type="spellEnd"/>
-      <w:r>
-        <w:t>. Good agreement was observed between Monte Carlo simulation and measurement for open fields.</w:t>
       </w:r>
     </w:p>
     <w:p/>
@@ -559,6 +459,7 @@
           <w:bCs/>
           <w:u w:val="single"/>
         </w:rPr>
+        <w:lastRenderedPageBreak/>
         <w:t>SUPPORTING DOCUMENT</w:t>
       </w:r>
     </w:p>
@@ -591,7 +492,6 @@
         </w:numPr>
       </w:pPr>
       <w:r>
-        <w:lastRenderedPageBreak/>
         <w:t>The Supporting Document </w:t>
       </w:r>
       <w:r>
@@ -631,60 +531,21 @@
           <w:b/>
           <w:bCs/>
         </w:rPr>
-        <w:t> STRONGLY ENCOURAGED, but optional, for PROFFERED submissions </w:t>
-      </w:r>
-      <w:r>
-        <w:t>and is </w:t>
+        <w:t> REQUIRED </w:t>
+      </w:r>
+      <w:r>
+        <w:t>for the following submission types and </w:t>
       </w:r>
       <w:r>
         <w:rPr>
           <w:b/>
           <w:bCs/>
         </w:rPr>
-        <w:t>limited to 1 page</w:t>
-      </w:r>
-      <w:r>
-        <w:t>.</w:t>
-      </w:r>
-    </w:p>
-    <w:p>
-      <w:pPr>
-        <w:numPr>
-          <w:ilvl w:val="0"/>
-          <w:numId w:val="6"/>
-        </w:numPr>
-      </w:pPr>
-      <w:r>
-        <w:t>A Supporting Document is</w:t>
-      </w:r>
-      <w:r>
-        <w:rPr>
-          <w:b/>
-          <w:bCs/>
-        </w:rPr>
-        <w:t> REQUIRED </w:t>
-      </w:r>
-      <w:r>
-        <w:t>for the following submission types and </w:t>
-      </w:r>
-      <w:r>
-        <w:rPr>
-          <w:b/>
-          <w:bCs/>
-        </w:rPr>
         <w:t>limited to 2 pages</w:t>
       </w:r>
       <w:r>
         <w:t>:</w:t>
       </w:r>
-    </w:p>
-    <w:p>
-      <w:pPr>
-        <w:numPr>
-          <w:ilvl w:val="0"/>
-          <w:numId w:val="7"/>
-        </w:numPr>
-      </w:pPr>
     </w:p>
     <w:p>
       <w:pPr>
@@ -692,8 +553,14 @@
           <w:ilvl w:val="1"/>
           <w:numId w:val="7"/>
         </w:numPr>
-      </w:pPr>
-      <w:r>
+        <w:rPr>
+          <w:highlight w:val="yellow"/>
+        </w:rPr>
+      </w:pPr>
+      <w:r>
+        <w:rPr>
+          <w:highlight w:val="yellow"/>
+        </w:rPr>
         <w:t>John R. Cameron &amp; John R. Cunningham Early-Career Investigator Symposium (ECIS)</w:t>
       </w:r>
     </w:p>
@@ -777,7 +644,7 @@
       <w:r>
         <w:t>Preferred format is illustrated in the </w:t>
       </w:r>
-      <w:hyperlink r:id="rId6" w:history="1">
+      <w:hyperlink r:id="rId7" w:history="1">
         <w:r>
           <w:rPr>
             <w:rStyle w:val="Hyperlink"/>
@@ -821,6 +688,1103 @@
         <w:t>The Supporting Document must be uploaded to our server by clicking the "Upload Supporting Document" icon that will appear on your status page once you have provided all the required information.</w:t>
       </w:r>
     </w:p>
+    <w:p/>
+    <w:p/>
+    <w:p/>
+    <w:p/>
+    <w:p/>
+    <w:p/>
+    <w:p/>
+    <w:p/>
+    <w:p/>
+    <w:p/>
+    <w:p/>
+    <w:p/>
+    <w:p>
+      <w:pPr>
+        <w:spacing w:line="240" w:lineRule="auto"/>
+        <w:rPr>
+          <w:rFonts w:ascii="Arial" w:hAnsi="Arial" w:cs="Arial"/>
+        </w:rPr>
+      </w:pPr>
+      <w:r>
+        <w:rPr>
+          <w:rFonts w:ascii="Arial" w:hAnsi="Arial" w:cs="Arial"/>
+          <w:b/>
+          <w:bCs/>
+        </w:rPr>
+        <w:lastRenderedPageBreak/>
+        <w:t xml:space="preserve">Innovation/Impact: </w:t>
+      </w:r>
+      <w:r>
+        <w:rPr>
+          <w:rFonts w:ascii="Arial" w:hAnsi="Arial" w:cs="Arial"/>
+        </w:rPr>
+        <w:t>This study is innovative because</w:t>
+      </w:r>
+      <w:r>
+        <w:rPr>
+          <w:rFonts w:ascii="Arial" w:hAnsi="Arial" w:cs="Arial"/>
+        </w:rPr>
+        <w:t xml:space="preserve"> it utilizes a novel </w:t>
+      </w:r>
+      <w:r>
+        <w:rPr>
+          <w:rFonts w:ascii="Arial" w:hAnsi="Arial" w:cs="Arial"/>
+        </w:rPr>
+        <w:t>methodology</w:t>
+      </w:r>
+      <w:r>
+        <w:rPr>
+          <w:rFonts w:ascii="Arial" w:hAnsi="Arial" w:cs="Arial"/>
+        </w:rPr>
+        <w:t xml:space="preserve"> to assess the heterogeneity of dose delivered to the circulating blood during Total Body Irradiation</w:t>
+      </w:r>
+      <w:r>
+        <w:rPr>
+          <w:rFonts w:ascii="Arial" w:hAnsi="Arial" w:cs="Arial"/>
+        </w:rPr>
+        <w:t xml:space="preserve"> (TBI). After assessing sweeping Cobalt-60 TBI the lingering concerns regarding </w:t>
+      </w:r>
+      <w:r>
+        <w:rPr>
+          <w:rFonts w:ascii="Arial" w:hAnsi="Arial" w:cs="Arial"/>
+        </w:rPr>
+        <w:t xml:space="preserve">the </w:t>
+      </w:r>
+      <w:r>
+        <w:rPr>
+          <w:rFonts w:ascii="Arial" w:hAnsi="Arial" w:cs="Arial"/>
+        </w:rPr>
+        <w:t xml:space="preserve">heterogeneity </w:t>
+      </w:r>
+      <w:r>
+        <w:rPr>
+          <w:rFonts w:ascii="Arial" w:hAnsi="Arial" w:cs="Arial"/>
+        </w:rPr>
+        <w:t>of the d</w:t>
+      </w:r>
+      <w:r>
+        <w:rPr>
+          <w:rFonts w:ascii="Arial" w:hAnsi="Arial" w:cs="Arial"/>
+        </w:rPr>
+        <w:t xml:space="preserve">ose </w:t>
+      </w:r>
+      <w:r>
+        <w:rPr>
+          <w:rFonts w:ascii="Arial" w:hAnsi="Arial" w:cs="Arial"/>
+        </w:rPr>
+        <w:t xml:space="preserve">delivered to </w:t>
+      </w:r>
+      <w:r>
+        <w:rPr>
+          <w:rFonts w:ascii="Arial" w:hAnsi="Arial" w:cs="Arial"/>
+        </w:rPr>
+        <w:t xml:space="preserve">circulating blood </w:t>
+      </w:r>
+      <w:r>
+        <w:rPr>
+          <w:rFonts w:ascii="Arial" w:hAnsi="Arial" w:cs="Arial"/>
+        </w:rPr>
+        <w:t xml:space="preserve">achieved by sequential techniques can be put to rest. </w:t>
+      </w:r>
+      <w:r>
+        <w:rPr>
+          <w:rFonts w:ascii="Arial" w:hAnsi="Arial" w:cs="Arial"/>
+        </w:rPr>
+        <w:t xml:space="preserve">                                                                           </w:t>
+      </w:r>
+      <w:r>
+        <w:rPr>
+          <w:rFonts w:ascii="Arial" w:hAnsi="Arial" w:cs="Arial"/>
+          <w:b/>
+          <w:bCs/>
+        </w:rPr>
+        <w:t>Key Results:</w:t>
+      </w:r>
+      <w:r>
+        <w:rPr>
+          <w:rFonts w:ascii="Arial" w:hAnsi="Arial" w:cs="Arial"/>
+          <w:b/>
+          <w:bCs/>
+        </w:rPr>
+        <w:t xml:space="preserve"> </w:t>
+      </w:r>
+      <w:r>
+        <w:rPr>
+          <w:rFonts w:ascii="Arial" w:hAnsi="Arial" w:cs="Arial"/>
+        </w:rPr>
+        <w:t xml:space="preserve">The study utilized a full-body phantom </w:t>
+      </w:r>
+      <w:r>
+        <w:rPr>
+          <w:rFonts w:ascii="Arial" w:hAnsi="Arial" w:cs="Arial"/>
+        </w:rPr>
+        <w:t>(Figure 1)</w:t>
+      </w:r>
+      <w:r>
+        <w:rPr>
+          <w:rFonts w:ascii="Arial" w:hAnsi="Arial" w:cs="Arial"/>
+        </w:rPr>
+        <w:t xml:space="preserve"> to provide both the geometry for the blood flow model and the medium for the Monte Carlo simulations. The blood flow model utilizes a combination of 1D and 0D compartments </w:t>
+      </w:r>
+      <w:r>
+        <w:rPr>
+          <w:rFonts w:ascii="Arial" w:hAnsi="Arial" w:cs="Arial"/>
+        </w:rPr>
+        <w:t xml:space="preserve">(Figure 2) </w:t>
+      </w:r>
+      <w:r>
+        <w:rPr>
+          <w:rFonts w:ascii="Arial" w:hAnsi="Arial" w:cs="Arial"/>
+        </w:rPr>
+        <w:t>and were validated against other published works</w:t>
+      </w:r>
+      <w:r>
+        <w:rPr>
+          <w:rFonts w:ascii="Arial" w:hAnsi="Arial" w:cs="Arial"/>
+        </w:rPr>
+        <w:t xml:space="preserve"> (Figure 3)</w:t>
+      </w:r>
+      <w:r>
+        <w:rPr>
+          <w:rFonts w:ascii="Arial" w:hAnsi="Arial" w:cs="Arial"/>
+        </w:rPr>
+        <w:t xml:space="preserve">. </w:t>
+      </w:r>
+      <w:r>
+        <w:rPr>
+          <w:rFonts w:ascii="Arial" w:hAnsi="Arial" w:cs="Arial"/>
+        </w:rPr>
+        <w:t>How d</w:t>
+      </w:r>
+      <w:r>
+        <w:rPr>
+          <w:rFonts w:ascii="Arial" w:hAnsi="Arial" w:cs="Arial"/>
+        </w:rPr>
+        <w:t>os</w:t>
+      </w:r>
+      <w:r>
+        <w:rPr>
+          <w:rFonts w:ascii="Arial" w:hAnsi="Arial" w:cs="Arial"/>
+        </w:rPr>
+        <w:t>e accumulated while travelling through vessels is described in Figure 4 and Figure 5 describes the process in the compartments</w:t>
+      </w:r>
+      <w:r>
+        <w:rPr>
+          <w:rFonts w:ascii="Arial" w:hAnsi="Arial" w:cs="Arial"/>
+        </w:rPr>
+        <w:t>.</w:t>
+      </w:r>
+      <w:r>
+        <w:rPr>
+          <w:rFonts w:ascii="Arial" w:hAnsi="Arial" w:cs="Arial"/>
+        </w:rPr>
+        <w:t xml:space="preserve"> </w:t>
+      </w:r>
+      <w:r>
+        <w:rPr>
+          <w:rFonts w:ascii="Arial" w:hAnsi="Arial" w:cs="Arial"/>
+        </w:rPr>
+        <w:t>For a sweeping</w:t>
+      </w:r>
+      <w:r>
+        <w:rPr>
+          <w:rFonts w:ascii="Arial" w:hAnsi="Arial" w:cs="Arial"/>
+        </w:rPr>
+        <w:t xml:space="preserve"> Cobalt-60 TBI </w:t>
+      </w:r>
+      <w:r>
+        <w:rPr>
+          <w:rFonts w:ascii="Arial" w:hAnsi="Arial" w:cs="Arial"/>
+        </w:rPr>
+        <w:t xml:space="preserve">the </w:t>
+      </w:r>
+      <w:r>
+        <w:rPr>
+          <w:rFonts w:ascii="Arial" w:hAnsi="Arial" w:cs="Arial"/>
+        </w:rPr>
+        <w:t>prescription</w:t>
+      </w:r>
+      <w:r>
+        <w:rPr>
+          <w:rFonts w:ascii="Arial" w:hAnsi="Arial" w:cs="Arial"/>
+        </w:rPr>
+        <w:t xml:space="preserve"> of</w:t>
+      </w:r>
+      <w:r>
+        <w:rPr>
+          <w:rFonts w:ascii="Arial" w:hAnsi="Arial" w:cs="Arial"/>
+        </w:rPr>
+        <w:t xml:space="preserve"> 12 Gy over 6 fractions. The resulting heterogeneity after one fraction </w:t>
+      </w:r>
+      <w:r>
+        <w:rPr>
+          <w:rFonts w:ascii="Arial" w:hAnsi="Arial" w:cs="Arial"/>
+        </w:rPr>
+        <w:t>and all fractions are presented in Figure 6.</w:t>
+      </w:r>
+    </w:p>
+    <w:tbl>
+      <w:tblPr>
+        <w:tblStyle w:val="TableGrid"/>
+        <w:tblW w:w="0" w:type="auto"/>
+        <w:tblLook w:val="04A0" w:firstRow="1" w:lastRow="0" w:firstColumn="1" w:lastColumn="0" w:noHBand="0" w:noVBand="1"/>
+      </w:tblPr>
+      <w:tblGrid>
+        <w:gridCol w:w="2958"/>
+        <w:gridCol w:w="7832"/>
+      </w:tblGrid>
+      <w:tr>
+        <w:tc>
+          <w:tcPr>
+            <w:tcW w:w="2958" w:type="dxa"/>
+            <w:vAlign w:val="center"/>
+          </w:tcPr>
+          <w:p>
+            <w:pPr>
+              <w:jc w:val="center"/>
+              <w:rPr>
+                <w:rFonts w:ascii="Arial" w:hAnsi="Arial" w:cs="Arial"/>
+              </w:rPr>
+            </w:pPr>
+            <w:r>
+              <w:rPr>
+                <w:noProof/>
+              </w:rPr>
+              <w:drawing>
+                <wp:inline distT="0" distB="0" distL="0" distR="0" wp14:anchorId="2D5F8ABE" wp14:editId="0E1CC3C0">
+                  <wp:extent cx="3624889" cy="1464497"/>
+                  <wp:effectExtent l="0" t="5715" r="8255" b="8255"/>
+                  <wp:docPr id="4941091" name="Picture 1"/>
+                  <wp:cNvGraphicFramePr>
+                    <a:graphicFrameLocks xmlns:a="http://schemas.openxmlformats.org/drawingml/2006/main" noChangeAspect="1"/>
+                  </wp:cNvGraphicFramePr>
+                  <a:graphic xmlns:a="http://schemas.openxmlformats.org/drawingml/2006/main">
+                    <a:graphicData uri="http://schemas.openxmlformats.org/drawingml/2006/picture">
+                      <pic:pic xmlns:pic="http://schemas.openxmlformats.org/drawingml/2006/picture">
+                        <pic:nvPicPr>
+                          <pic:cNvPr id="4941091" name=""/>
+                          <pic:cNvPicPr/>
+                        </pic:nvPicPr>
+                        <pic:blipFill>
+                          <a:blip r:embed="rId8"/>
+                          <a:stretch>
+                            <a:fillRect/>
+                          </a:stretch>
+                        </pic:blipFill>
+                        <pic:spPr>
+                          <a:xfrm rot="16200000">
+                            <a:off x="0" y="0"/>
+                            <a:ext cx="3635150" cy="1468643"/>
+                          </a:xfrm>
+                          <a:prstGeom prst="rect">
+                            <a:avLst/>
+                          </a:prstGeom>
+                        </pic:spPr>
+                      </pic:pic>
+                    </a:graphicData>
+                  </a:graphic>
+                </wp:inline>
+              </w:drawing>
+            </w:r>
+          </w:p>
+        </w:tc>
+        <w:tc>
+          <w:tcPr>
+            <w:tcW w:w="7832" w:type="dxa"/>
+            <w:vAlign w:val="center"/>
+          </w:tcPr>
+          <w:p>
+            <w:pPr>
+              <w:jc w:val="center"/>
+              <w:rPr>
+                <w:noProof/>
+              </w:rPr>
+            </w:pPr>
+            <w:r>
+              <w:rPr>
+                <w:noProof/>
+              </w:rPr>
+              <w:drawing>
+                <wp:anchor distT="0" distB="0" distL="114300" distR="114300" simplePos="0" relativeHeight="251658240" behindDoc="1" locked="0" layoutInCell="1" allowOverlap="1" wp14:anchorId="4517F4EA" wp14:editId="0604A29B">
+                  <wp:simplePos x="0" y="0"/>
+                  <wp:positionH relativeFrom="column">
+                    <wp:posOffset>17618</wp:posOffset>
+                  </wp:positionH>
+                  <wp:positionV relativeFrom="paragraph">
+                    <wp:posOffset>162</wp:posOffset>
+                  </wp:positionV>
+                  <wp:extent cx="4300220" cy="3284855"/>
+                  <wp:effectExtent l="0" t="0" r="5080" b="0"/>
+                  <wp:wrapTight wrapText="bothSides">
+                    <wp:wrapPolygon edited="0">
+                      <wp:start x="0" y="0"/>
+                      <wp:lineTo x="0" y="21420"/>
+                      <wp:lineTo x="21530" y="21420"/>
+                      <wp:lineTo x="21530" y="0"/>
+                      <wp:lineTo x="0" y="0"/>
+                    </wp:wrapPolygon>
+                  </wp:wrapTight>
+                  <wp:docPr id="1621908591" name="Picture 1"/>
+                  <wp:cNvGraphicFramePr>
+                    <a:graphicFrameLocks xmlns:a="http://schemas.openxmlformats.org/drawingml/2006/main" noChangeAspect="1"/>
+                  </wp:cNvGraphicFramePr>
+                  <a:graphic xmlns:a="http://schemas.openxmlformats.org/drawingml/2006/main">
+                    <a:graphicData uri="http://schemas.openxmlformats.org/drawingml/2006/picture">
+                      <pic:pic xmlns:pic="http://schemas.openxmlformats.org/drawingml/2006/picture">
+                        <pic:nvPicPr>
+                          <pic:cNvPr id="1621908591" name=""/>
+                          <pic:cNvPicPr/>
+                        </pic:nvPicPr>
+                        <pic:blipFill>
+                          <a:blip r:embed="rId9" cstate="print">
+                            <a:extLst>
+                              <a:ext uri="{28A0092B-C50C-407E-A947-70E740481C1C}">
+                                <a14:useLocalDpi xmlns:a14="http://schemas.microsoft.com/office/drawing/2010/main" val="0"/>
+                              </a:ext>
+                            </a:extLst>
+                          </a:blip>
+                          <a:stretch>
+                            <a:fillRect/>
+                          </a:stretch>
+                        </pic:blipFill>
+                        <pic:spPr>
+                          <a:xfrm>
+                            <a:off x="0" y="0"/>
+                            <a:ext cx="4300220" cy="3284855"/>
+                          </a:xfrm>
+                          <a:prstGeom prst="rect">
+                            <a:avLst/>
+                          </a:prstGeom>
+                        </pic:spPr>
+                      </pic:pic>
+                    </a:graphicData>
+                  </a:graphic>
+                  <wp14:sizeRelH relativeFrom="page">
+                    <wp14:pctWidth>0</wp14:pctWidth>
+                  </wp14:sizeRelH>
+                  <wp14:sizeRelV relativeFrom="page">
+                    <wp14:pctHeight>0</wp14:pctHeight>
+                  </wp14:sizeRelV>
+                </wp:anchor>
+              </w:drawing>
+            </w:r>
+          </w:p>
+        </w:tc>
+      </w:tr>
+      <w:tr>
+        <w:tc>
+          <w:tcPr>
+            <w:tcW w:w="2958" w:type="dxa"/>
+          </w:tcPr>
+          <w:p>
+            <w:pPr>
+              <w:rPr>
+                <w:rFonts w:ascii="Arial" w:hAnsi="Arial" w:cs="Arial"/>
+              </w:rPr>
+            </w:pPr>
+            <w:r>
+              <w:rPr>
+                <w:rFonts w:ascii="Arial" w:hAnsi="Arial" w:cs="Arial"/>
+              </w:rPr>
+              <w:t xml:space="preserve">Figure 1: Outline of the full-body phantom with the modelled vessels (black) and a sub-set of the organ compartments </w:t>
+            </w:r>
+            <w:r>
+              <w:rPr>
+                <w:rFonts w:ascii="Arial" w:hAnsi="Arial" w:cs="Arial"/>
+              </w:rPr>
+              <w:t>visualized</w:t>
+            </w:r>
+            <w:r>
+              <w:rPr>
+                <w:rFonts w:ascii="Arial" w:hAnsi="Arial" w:cs="Arial"/>
+              </w:rPr>
+              <w:t xml:space="preserve"> (dark grey, yellow and red).</w:t>
+            </w:r>
+          </w:p>
+        </w:tc>
+        <w:tc>
+          <w:tcPr>
+            <w:tcW w:w="7832" w:type="dxa"/>
+          </w:tcPr>
+          <w:p>
+            <w:pPr>
+              <w:rPr>
+                <w:rFonts w:ascii="Arial" w:hAnsi="Arial" w:cs="Arial"/>
+              </w:rPr>
+            </w:pPr>
+            <w:r>
+              <w:rPr>
+                <w:rFonts w:ascii="Arial" w:hAnsi="Arial" w:cs="Arial"/>
+              </w:rPr>
+              <w:t xml:space="preserve">Figure 2: Transition diagram for the blood flow model. Solid lines (red) are arterial flow and dashed lines (blue) are venous. The thick boxes represent one-dimensional </w:t>
+            </w:r>
+            <w:r>
+              <w:rPr>
+                <w:rFonts w:ascii="Arial" w:hAnsi="Arial" w:cs="Arial"/>
+              </w:rPr>
+              <w:t>vessels,</w:t>
+            </w:r>
+            <w:r>
+              <w:rPr>
+                <w:rFonts w:ascii="Arial" w:hAnsi="Arial" w:cs="Arial"/>
+              </w:rPr>
+              <w:t xml:space="preserve"> and the thin boxes represent zero-dimensional compartments. </w:t>
+            </w:r>
+          </w:p>
+        </w:tc>
+      </w:tr>
+      <w:tr>
+        <w:tc>
+          <w:tcPr>
+            <w:tcW w:w="2958" w:type="dxa"/>
+          </w:tcPr>
+          <w:p>
+            <w:pPr>
+              <w:rPr>
+                <w:rFonts w:ascii="Arial" w:hAnsi="Arial" w:cs="Arial"/>
+              </w:rPr>
+            </w:pPr>
+            <w:r>
+              <w:rPr>
+                <w:rFonts w:ascii="Arial" w:hAnsi="Arial" w:cs="Arial"/>
+              </w:rPr>
+              <w:t>Figure 3: The mean return time, the time it takes a blood volume to fully cycle through the circulatory and return to its starting compartment, of our blood flow simulation in comparison to another dosimetry focused blood flow model from Shin et al. [1].</w:t>
+            </w:r>
+          </w:p>
+        </w:tc>
+        <w:tc>
+          <w:tcPr>
+            <w:tcW w:w="7832" w:type="dxa"/>
+            <w:vAlign w:val="center"/>
+          </w:tcPr>
+          <w:p>
+            <w:pPr>
+              <w:jc w:val="center"/>
+              <w:rPr>
+                <w:rFonts w:ascii="Arial" w:hAnsi="Arial" w:cs="Arial"/>
+              </w:rPr>
+            </w:pPr>
+            <w:r>
+              <w:rPr>
+                <w:rFonts w:ascii="Arial" w:hAnsi="Arial" w:cs="Arial"/>
+              </w:rPr>
+              <w:drawing>
+                <wp:anchor distT="0" distB="0" distL="114300" distR="114300" simplePos="0" relativeHeight="251659264" behindDoc="1" locked="0" layoutInCell="1" allowOverlap="1" wp14:anchorId="55B1BC97" wp14:editId="0BE25C89">
+                  <wp:simplePos x="0" y="0"/>
+                  <wp:positionH relativeFrom="column">
+                    <wp:posOffset>-1005205</wp:posOffset>
+                  </wp:positionH>
+                  <wp:positionV relativeFrom="paragraph">
+                    <wp:posOffset>-61595</wp:posOffset>
+                  </wp:positionV>
+                  <wp:extent cx="3147060" cy="2482850"/>
+                  <wp:effectExtent l="0" t="0" r="0" b="0"/>
+                  <wp:wrapSquare wrapText="bothSides"/>
+                  <wp:docPr id="1364310892" name="Picture 4" descr="A graph of the different types of organs&#10;&#10;AI-generated content may be incorrect.">
+                    <a:extLst xmlns:a="http://schemas.openxmlformats.org/drawingml/2006/main">
+                      <a:ext uri="{FF2B5EF4-FFF2-40B4-BE49-F238E27FC236}">
+                        <a16:creationId xmlns:a16="http://schemas.microsoft.com/office/drawing/2014/main" id="{D252DDAA-922E-4ABC-6812-CC24F5F6947B}"/>
+                      </a:ext>
+                    </a:extLst>
+                  </wp:docPr>
+                  <wp:cNvGraphicFramePr>
+                    <a:graphicFrameLocks xmlns:a="http://schemas.openxmlformats.org/drawingml/2006/main" noChangeAspect="1"/>
+                  </wp:cNvGraphicFramePr>
+                  <a:graphic xmlns:a="http://schemas.openxmlformats.org/drawingml/2006/main">
+                    <a:graphicData uri="http://schemas.openxmlformats.org/drawingml/2006/picture">
+                      <pic:pic xmlns:pic="http://schemas.openxmlformats.org/drawingml/2006/picture">
+                        <pic:nvPicPr>
+                          <pic:cNvPr id="5" name="Picture 4" descr="A graph of the different types of organs&#10;&#10;AI-generated content may be incorrect.">
+                            <a:extLst>
+                              <a:ext uri="{FF2B5EF4-FFF2-40B4-BE49-F238E27FC236}">
+                                <a16:creationId xmlns:a16="http://schemas.microsoft.com/office/drawing/2014/main" id="{D252DDAA-922E-4ABC-6812-CC24F5F6947B}"/>
+                              </a:ext>
+                            </a:extLst>
+                          </pic:cNvPr>
+                          <pic:cNvPicPr>
+                            <a:picLocks noChangeAspect="1"/>
+                          </pic:cNvPicPr>
+                        </pic:nvPicPr>
+                        <pic:blipFill>
+                          <a:blip r:embed="rId10" cstate="print">
+                            <a:extLst>
+                              <a:ext uri="{28A0092B-C50C-407E-A947-70E740481C1C}">
+                                <a14:useLocalDpi xmlns:a14="http://schemas.microsoft.com/office/drawing/2010/main" val="0"/>
+                              </a:ext>
+                            </a:extLst>
+                          </a:blip>
+                          <a:stretch>
+                            <a:fillRect/>
+                          </a:stretch>
+                        </pic:blipFill>
+                        <pic:spPr>
+                          <a:xfrm>
+                            <a:off x="0" y="0"/>
+                            <a:ext cx="3147060" cy="2482850"/>
+                          </a:xfrm>
+                          <a:prstGeom prst="rect">
+                            <a:avLst/>
+                          </a:prstGeom>
+                        </pic:spPr>
+                      </pic:pic>
+                    </a:graphicData>
+                  </a:graphic>
+                  <wp14:sizeRelH relativeFrom="margin">
+                    <wp14:pctWidth>0</wp14:pctWidth>
+                  </wp14:sizeRelH>
+                  <wp14:sizeRelV relativeFrom="margin">
+                    <wp14:pctHeight>0</wp14:pctHeight>
+                  </wp14:sizeRelV>
+                </wp:anchor>
+              </w:drawing>
+            </w:r>
+          </w:p>
+        </w:tc>
+      </w:tr>
+    </w:tbl>
+    <w:p/>
+    <w:tbl>
+      <w:tblPr>
+        <w:tblStyle w:val="TableGrid"/>
+        <w:tblW w:w="0" w:type="auto"/>
+        <w:tblLook w:val="04A0" w:firstRow="1" w:lastRow="0" w:firstColumn="1" w:lastColumn="0" w:noHBand="0" w:noVBand="1"/>
+      </w:tblPr>
+      <w:tblGrid>
+        <w:gridCol w:w="6302"/>
+        <w:gridCol w:w="4488"/>
+      </w:tblGrid>
+      <w:tr>
+        <w:tc>
+          <w:tcPr>
+            <w:tcW w:w="6302" w:type="dxa"/>
+            <w:vAlign w:val="center"/>
+          </w:tcPr>
+          <w:p>
+            <w:pPr>
+              <w:jc w:val="center"/>
+            </w:pPr>
+            <w:r>
+              <w:lastRenderedPageBreak/>
+              <w:drawing>
+                <wp:inline distT="0" distB="0" distL="0" distR="0" wp14:anchorId="22C71597" wp14:editId="027B70A8">
+                  <wp:extent cx="3959149" cy="2583711"/>
+                  <wp:effectExtent l="0" t="0" r="3810" b="7620"/>
+                  <wp:docPr id="1176523592" name="Picture 1"/>
+                  <wp:cNvGraphicFramePr>
+                    <a:graphicFrameLocks xmlns:a="http://schemas.openxmlformats.org/drawingml/2006/main" noChangeAspect="1"/>
+                  </wp:cNvGraphicFramePr>
+                  <a:graphic xmlns:a="http://schemas.openxmlformats.org/drawingml/2006/main">
+                    <a:graphicData uri="http://schemas.openxmlformats.org/drawingml/2006/picture">
+                      <pic:pic xmlns:pic="http://schemas.openxmlformats.org/drawingml/2006/picture">
+                        <pic:nvPicPr>
+                          <pic:cNvPr id="1176523592" name=""/>
+                          <pic:cNvPicPr/>
+                        </pic:nvPicPr>
+                        <pic:blipFill>
+                          <a:blip r:embed="rId11"/>
+                          <a:stretch>
+                            <a:fillRect/>
+                          </a:stretch>
+                        </pic:blipFill>
+                        <pic:spPr>
+                          <a:xfrm>
+                            <a:off x="0" y="0"/>
+                            <a:ext cx="3995873" cy="2607677"/>
+                          </a:xfrm>
+                          <a:prstGeom prst="rect">
+                            <a:avLst/>
+                          </a:prstGeom>
+                        </pic:spPr>
+                      </pic:pic>
+                    </a:graphicData>
+                  </a:graphic>
+                </wp:inline>
+              </w:drawing>
+            </w:r>
+          </w:p>
+        </w:tc>
+        <w:tc>
+          <w:tcPr>
+            <w:tcW w:w="4488" w:type="dxa"/>
+            <w:vAlign w:val="center"/>
+          </w:tcPr>
+          <w:p>
+            <w:pPr>
+              <w:jc w:val="center"/>
+            </w:pPr>
+            <w:r>
+              <w:drawing>
+                <wp:inline distT="0" distB="0" distL="0" distR="0" wp14:anchorId="2FD6C023" wp14:editId="262720A1">
+                  <wp:extent cx="2775508" cy="3413051"/>
+                  <wp:effectExtent l="0" t="0" r="6350" b="0"/>
+                  <wp:docPr id="1877676998" name="Picture 1"/>
+                  <wp:cNvGraphicFramePr>
+                    <a:graphicFrameLocks xmlns:a="http://schemas.openxmlformats.org/drawingml/2006/main" noChangeAspect="1"/>
+                  </wp:cNvGraphicFramePr>
+                  <a:graphic xmlns:a="http://schemas.openxmlformats.org/drawingml/2006/main">
+                    <a:graphicData uri="http://schemas.openxmlformats.org/drawingml/2006/picture">
+                      <pic:pic xmlns:pic="http://schemas.openxmlformats.org/drawingml/2006/picture">
+                        <pic:nvPicPr>
+                          <pic:cNvPr id="1877676998" name=""/>
+                          <pic:cNvPicPr/>
+                        </pic:nvPicPr>
+                        <pic:blipFill>
+                          <a:blip r:embed="rId12"/>
+                          <a:stretch>
+                            <a:fillRect/>
+                          </a:stretch>
+                        </pic:blipFill>
+                        <pic:spPr>
+                          <a:xfrm>
+                            <a:off x="0" y="0"/>
+                            <a:ext cx="2785865" cy="3425787"/>
+                          </a:xfrm>
+                          <a:prstGeom prst="rect">
+                            <a:avLst/>
+                          </a:prstGeom>
+                        </pic:spPr>
+                      </pic:pic>
+                    </a:graphicData>
+                  </a:graphic>
+                </wp:inline>
+              </w:drawing>
+            </w:r>
+          </w:p>
+        </w:tc>
+      </w:tr>
+      <w:tr>
+        <w:tc>
+          <w:tcPr>
+            <w:tcW w:w="6302" w:type="dxa"/>
+          </w:tcPr>
+          <w:p>
+            <w:r>
+              <w:t>Figure 4: Diagram</w:t>
+            </w:r>
+            <w:r>
+              <w:t>s</w:t>
+            </w:r>
+            <w:r>
+              <w:t xml:space="preserve"> explaining how dose to </w:t>
+            </w:r>
+            <w:r>
+              <w:t>blood volume</w:t>
+            </w:r>
+            <w:r>
+              <w:t>s</w:t>
+            </w:r>
+            <w:r>
+              <w:t xml:space="preserve"> (BV)</w:t>
+            </w:r>
+            <w:r>
+              <w:t xml:space="preserve"> in vessels</w:t>
+            </w:r>
+            <w:r>
+              <w:t xml:space="preserve"> are</w:t>
+            </w:r>
+            <w:r>
+              <w:t xml:space="preserve"> calculated over a time step </w:t>
+            </w:r>
+            <w:r>
+              <w:t>(</w:t>
+            </w:r>
+            <w:proofErr w:type="spellStart"/>
+            <w:r>
+              <w:t>Δ</w:t>
+            </w:r>
+            <w:r>
+              <w:rPr>
+                <w:i/>
+                <w:iCs/>
+              </w:rPr>
+              <w:t>t</w:t>
+            </w:r>
+            <w:proofErr w:type="spellEnd"/>
+            <w:r>
+              <w:rPr>
+                <w:i/>
+                <w:iCs/>
+              </w:rPr>
+              <w:t>).</w:t>
+            </w:r>
+            <w:r>
+              <w:t xml:space="preserve"> (</w:t>
+            </w:r>
+            <w:r>
+              <w:t>A</w:t>
+            </w:r>
+            <w:r>
+              <w:t>) A BV’s current position (</w:t>
+            </w:r>
+            <m:oMath>
+              <m:sSub>
+                <m:sSubPr>
+                  <m:ctrlPr>
+                    <w:rPr>
+                      <w:rFonts w:ascii="Cambria Math" w:hAnsi="Cambria Math"/>
+                      <w:i/>
+                    </w:rPr>
+                  </m:ctrlPr>
+                </m:sSubPr>
+                <m:e>
+                  <m:r>
+                    <w:rPr>
+                      <w:rFonts w:ascii="Cambria Math" w:hAnsi="Cambria Math"/>
+                    </w:rPr>
+                    <m:t>x</m:t>
+                  </m:r>
+                </m:e>
+                <m:sub>
+                  <m:r>
+                    <w:rPr>
+                      <w:rFonts w:ascii="Cambria Math" w:hAnsi="Cambria Math"/>
+                    </w:rPr>
+                    <m:t>i</m:t>
+                  </m:r>
+                </m:sub>
+              </m:sSub>
+            </m:oMath>
+            <w:r>
+              <w:t>) and the current time (</w:t>
+            </w:r>
+            <m:oMath>
+              <m:sSub>
+                <m:sSubPr>
+                  <m:ctrlPr>
+                    <w:rPr>
+                      <w:rFonts w:ascii="Cambria Math" w:hAnsi="Cambria Math"/>
+                      <w:i/>
+                    </w:rPr>
+                  </m:ctrlPr>
+                </m:sSubPr>
+                <m:e>
+                  <m:r>
+                    <w:rPr>
+                      <w:rFonts w:ascii="Cambria Math" w:hAnsi="Cambria Math"/>
+                    </w:rPr>
+                    <m:t>t</m:t>
+                  </m:r>
+                </m:e>
+                <m:sub>
+                  <m:r>
+                    <w:rPr>
+                      <w:rFonts w:ascii="Cambria Math" w:hAnsi="Cambria Math"/>
+                    </w:rPr>
+                    <m:t>i</m:t>
+                  </m:r>
+                </m:sub>
+              </m:sSub>
+            </m:oMath>
+            <w:r>
+              <w:t>) is used to query the flow velocity</w:t>
+            </w:r>
+            <w:r>
+              <w:t>,</w:t>
+            </w:r>
+            <w:r>
+              <w:t xml:space="preserve"> (</w:t>
+            </w:r>
+            <w:r>
+              <w:t>B</w:t>
+            </w:r>
+            <w:r>
+              <w:t>)</w:t>
+            </w:r>
+            <w:r>
+              <w:t>,</w:t>
+            </w:r>
+            <w:r>
+              <w:t xml:space="preserve"> and determine the instantaneous velocity (</w:t>
+            </w:r>
+            <m:oMath>
+              <m:r>
+                <w:rPr>
+                  <w:rFonts w:ascii="Cambria Math" w:hAnsi="Cambria Math"/>
+                </w:rPr>
+                <m:t>v</m:t>
+              </m:r>
+              <m:d>
+                <m:dPr>
+                  <m:ctrlPr>
+                    <w:rPr>
+                      <w:rFonts w:ascii="Cambria Math" w:hAnsi="Cambria Math"/>
+                      <w:i/>
+                    </w:rPr>
+                  </m:ctrlPr>
+                </m:dPr>
+                <m:e>
+                  <m:sSub>
+                    <m:sSubPr>
+                      <m:ctrlPr>
+                        <w:rPr>
+                          <w:rFonts w:ascii="Cambria Math" w:hAnsi="Cambria Math"/>
+                          <w:i/>
+                        </w:rPr>
+                      </m:ctrlPr>
+                    </m:sSubPr>
+                    <m:e>
+                      <m:r>
+                        <w:rPr>
+                          <w:rFonts w:ascii="Cambria Math" w:hAnsi="Cambria Math"/>
+                        </w:rPr>
+                        <m:t>t</m:t>
+                      </m:r>
+                    </m:e>
+                    <m:sub>
+                      <m:r>
+                        <w:rPr>
+                          <w:rFonts w:ascii="Cambria Math" w:hAnsi="Cambria Math"/>
+                        </w:rPr>
+                        <m:t>i</m:t>
+                      </m:r>
+                    </m:sub>
+                  </m:sSub>
+                </m:e>
+              </m:d>
+              <m:r>
+                <w:rPr>
+                  <w:rFonts w:ascii="Cambria Math" w:hAnsi="Cambria Math"/>
+                </w:rPr>
+                <m:t>)</m:t>
+              </m:r>
+            </m:oMath>
+            <w:r>
+              <w:rPr>
+                <w:rFonts w:eastAsiaTheme="minorEastAsia"/>
+              </w:rPr>
+              <w:t xml:space="preserve"> and thus the BVs change in position (</w:t>
+            </w:r>
+            <m:oMath>
+              <m:r>
+                <w:rPr>
+                  <w:rFonts w:ascii="Cambria Math" w:eastAsiaTheme="minorEastAsia" w:hAnsi="Cambria Math"/>
+                </w:rPr>
+                <m:t>∆x</m:t>
+              </m:r>
+            </m:oMath>
+            <w:r>
+              <w:rPr>
+                <w:rFonts w:eastAsiaTheme="minorEastAsia"/>
+              </w:rPr>
+              <w:t>). (</w:t>
+            </w:r>
+            <w:r>
+              <w:rPr>
+                <w:rFonts w:eastAsiaTheme="minorEastAsia"/>
+              </w:rPr>
+              <w:t>C</w:t>
+            </w:r>
+            <w:r>
+              <w:rPr>
+                <w:rFonts w:eastAsiaTheme="minorEastAsia"/>
+              </w:rPr>
+              <w:t>) The new BV position (</w:t>
+            </w:r>
+            <m:oMath>
+              <m:sSub>
+                <m:sSubPr>
+                  <m:ctrlPr>
+                    <w:rPr>
+                      <w:rFonts w:ascii="Cambria Math" w:eastAsiaTheme="minorEastAsia" w:hAnsi="Cambria Math"/>
+                      <w:i/>
+                    </w:rPr>
+                  </m:ctrlPr>
+                </m:sSubPr>
+                <m:e>
+                  <m:r>
+                    <w:rPr>
+                      <w:rFonts w:ascii="Cambria Math" w:eastAsiaTheme="minorEastAsia" w:hAnsi="Cambria Math"/>
+                    </w:rPr>
+                    <m:t>x</m:t>
+                  </m:r>
+                </m:e>
+                <m:sub>
+                  <m:r>
+                    <w:rPr>
+                      <w:rFonts w:ascii="Cambria Math" w:eastAsiaTheme="minorEastAsia" w:hAnsi="Cambria Math"/>
+                    </w:rPr>
+                    <m:t>f</m:t>
+                  </m:r>
+                </m:sub>
+              </m:sSub>
+            </m:oMath>
+            <w:r>
+              <w:rPr>
+                <w:rFonts w:eastAsiaTheme="minorEastAsia"/>
+              </w:rPr>
+              <w:t>) and current time is used to query the four-dimensional dose data to determine the dose to the BV</w:t>
+            </w:r>
+            <w:r>
+              <w:rPr>
+                <w:rFonts w:eastAsiaTheme="minorEastAsia"/>
+              </w:rPr>
+              <w:t xml:space="preserve"> (</w:t>
+            </w:r>
+            <w:r>
+              <w:rPr>
+                <w:rFonts w:eastAsiaTheme="minorEastAsia"/>
+                <w:i/>
+                <w:iCs/>
+              </w:rPr>
+              <w:t>d</w:t>
+            </w:r>
+            <w:r>
+              <w:rPr>
+                <w:rFonts w:eastAsiaTheme="minorEastAsia"/>
+              </w:rPr>
+              <w:t xml:space="preserve">). (D) Dose is calculated using the queried dose data, time step size and </w:t>
+            </w:r>
+            <w:proofErr w:type="gramStart"/>
+            <w:r>
+              <w:rPr>
+                <w:rFonts w:eastAsiaTheme="minorEastAsia"/>
+              </w:rPr>
+              <w:t>a</w:t>
+            </w:r>
+            <w:proofErr w:type="gramEnd"/>
+            <w:r>
+              <w:rPr>
+                <w:rFonts w:eastAsiaTheme="minorEastAsia"/>
+              </w:rPr>
+              <w:t xml:space="preserve"> absolute dosimetry conversion factor. </w:t>
+            </w:r>
+          </w:p>
+        </w:tc>
+        <w:tc>
+          <w:tcPr>
+            <w:tcW w:w="4488" w:type="dxa"/>
+          </w:tcPr>
+          <w:p>
+            <w:r>
+              <w:t xml:space="preserve">Figure 5: Diagrams explain how dose to blood volumes (BVs) in compartments are calculated over a time step </w:t>
+            </w:r>
+            <w:r>
+              <w:t>(</w:t>
+            </w:r>
+            <w:proofErr w:type="spellStart"/>
+            <w:r>
+              <w:t>Δ</w:t>
+            </w:r>
+            <w:r>
+              <w:rPr>
+                <w:i/>
+                <w:iCs/>
+              </w:rPr>
+              <w:t>t</w:t>
+            </w:r>
+            <w:proofErr w:type="spellEnd"/>
+            <w:r>
+              <w:t>).</w:t>
+            </w:r>
+            <w:r>
+              <w:t xml:space="preserve"> (</w:t>
+            </w:r>
+            <w:r>
+              <w:t>A</w:t>
+            </w:r>
+            <w:r>
+              <w:t xml:space="preserve">) </w:t>
+            </w:r>
+            <w:r>
+              <w:t>The energy deposition rate (ER(</w:t>
+            </w:r>
+            <w:r>
+              <w:rPr>
+                <w:i/>
+                <w:iCs/>
+              </w:rPr>
+              <w:t>t</w:t>
+            </w:r>
+            <w:r>
+              <w:t>)) within the compartment is sampled at the current time (</w:t>
+            </w:r>
+            <w:r>
+              <w:rPr>
+                <w:i/>
+                <w:iCs/>
+              </w:rPr>
+              <w:t>t</w:t>
+            </w:r>
+            <w:r>
+              <w:t>). (</w:t>
+            </w:r>
+            <w:r>
+              <w:t>B</w:t>
+            </w:r>
+            <w:r>
+              <w:t xml:space="preserve">) The dose </w:t>
+            </w:r>
+            <w:r>
+              <w:t xml:space="preserve">value </w:t>
+            </w:r>
+            <w:r>
+              <w:t>(</w:t>
+            </w:r>
+            <w:r>
+              <w:rPr>
+                <w:i/>
+                <w:iCs/>
+              </w:rPr>
+              <w:t>D</w:t>
+            </w:r>
+            <w:r>
+              <w:t xml:space="preserve">) </w:t>
+            </w:r>
+            <w:r>
+              <w:t>is</w:t>
+            </w:r>
+            <w:r>
+              <w:t xml:space="preserve"> randomly sampled from the dose volume histogram</w:t>
+            </w:r>
+            <w:r>
+              <w:t>. (C) Dose is calculated by determining the instantaneous dose rate and multiplying by the time step.</w:t>
+            </w:r>
+          </w:p>
+        </w:tc>
+      </w:tr>
+      <w:tr>
+        <w:tc>
+          <w:tcPr>
+            <w:tcW w:w="10790" w:type="dxa"/>
+            <w:gridSpan w:val="2"/>
+          </w:tcPr>
+          <w:p/>
+        </w:tc>
+      </w:tr>
+      <w:tr>
+        <w:tc>
+          <w:tcPr>
+            <w:tcW w:w="10790" w:type="dxa"/>
+            <w:gridSpan w:val="2"/>
+          </w:tcPr>
+          <w:p/>
+        </w:tc>
+      </w:tr>
+    </w:tbl>
+    <w:p>
+      <w:r>
+        <w:t xml:space="preserve">[1] </w:t>
+      </w:r>
+      <w:r>
+        <w:t xml:space="preserve">Shin J, Xing S, McCullum L, et al. HEDOS—a computational tool to assess radiation dose to circulating blood cells during external beam radiotherapy based on whole-body blood flow simulations. </w:t>
+      </w:r>
+      <w:r>
+        <w:rPr>
+          <w:i/>
+          <w:iCs/>
+        </w:rPr>
+        <w:t>Phys Med Biol</w:t>
+      </w:r>
+      <w:r>
+        <w:t>. 2021;66(16):164001</w:t>
+      </w:r>
+      <w:r>
+        <w:t xml:space="preserve"> </w:t>
+      </w:r>
+    </w:p>
+    <w:p/>
     <w:p>
       <w:r>
         <w:rPr>
@@ -843,7 +1807,7 @@
                     <pic:cNvPicPr/>
                   </pic:nvPicPr>
                   <pic:blipFill>
-                    <a:blip r:embed="rId7"/>
+                    <a:blip r:embed="rId13"/>
                     <a:stretch>
                       <a:fillRect/>
                     </a:stretch>
@@ -866,7 +1830,7 @@
     </w:p>
     <w:sectPr>
       <w:pgSz w:w="12240" w:h="15840"/>
-      <w:pgMar w:top="1440" w:right="1440" w:bottom="1440" w:left="1440" w:header="708" w:footer="708" w:gutter="0"/>
+      <w:pgMar w:top="720" w:right="720" w:bottom="720" w:left="720" w:header="708" w:footer="708" w:gutter="0"/>
       <w:cols w:space="708"/>
       <w:docGrid w:linePitch="360"/>
     </w:sectPr>
@@ -3150,6 +4114,47 @@
       <w:shd w:val="clear" w:color="auto" w:fill="E1DFDD"/>
     </w:rPr>
   </w:style>
+  <w:style w:type="character" w:styleId="FollowedHyperlink">
+    <w:name w:val="FollowedHyperlink"/>
+    <w:basedOn w:val="DefaultParagraphFont"/>
+    <w:uiPriority w:val="99"/>
+    <w:semiHidden/>
+    <w:unhideWhenUsed/>
+    <w:rsid w:val="00A22326"/>
+    <w:rPr>
+      <w:color w:val="96607D" w:themeColor="followedHyperlink"/>
+      <w:u w:val="single"/>
+    </w:rPr>
+  </w:style>
+  <w:style w:type="table" w:styleId="TableGrid">
+    <w:name w:val="Table Grid"/>
+    <w:basedOn w:val="TableNormal"/>
+    <w:uiPriority w:val="39"/>
+    <w:rsid w:val="00C833FB"/>
+    <w:pPr>
+      <w:spacing w:after="0" w:line="240" w:lineRule="auto"/>
+    </w:pPr>
+    <w:tblPr>
+      <w:tblBorders>
+        <w:top w:val="single" w:sz="4" w:space="0" w:color="auto"/>
+        <w:left w:val="single" w:sz="4" w:space="0" w:color="auto"/>
+        <w:bottom w:val="single" w:sz="4" w:space="0" w:color="auto"/>
+        <w:right w:val="single" w:sz="4" w:space="0" w:color="auto"/>
+        <w:insideH w:val="single" w:sz="4" w:space="0" w:color="auto"/>
+        <w:insideV w:val="single" w:sz="4" w:space="0" w:color="auto"/>
+      </w:tblBorders>
+    </w:tblPr>
+  </w:style>
+  <w:style w:type="character" w:styleId="PlaceholderText">
+    <w:name w:val="Placeholder Text"/>
+    <w:basedOn w:val="DefaultParagraphFont"/>
+    <w:uiPriority w:val="99"/>
+    <w:semiHidden/>
+    <w:rsid w:val="00F5618B"/>
+    <w:rPr>
+      <w:color w:val="666666"/>
+    </w:rPr>
+  </w:style>
 </w:styles>
 </file>
 
@@ -3446,4 +4451,16 @@
     </a:ext>
   </a:extLst>
 </a:theme>
+</file>
+
+<file path=customXml/item1.xml><?xml version="1.0" encoding="utf-8"?>
+<b:Sources xmlns:b="http://schemas.openxmlformats.org/officeDocument/2006/bibliography" xmlns="http://schemas.openxmlformats.org/officeDocument/2006/bibliography" SelectedStyle="\APASixthEditionOfficeOnline.xsl" StyleName="APA" Version="6"/>
+</file>
+
+<file path=customXml/itemProps1.xml><?xml version="1.0" encoding="utf-8"?>
+<ds:datastoreItem xmlns:ds="http://schemas.openxmlformats.org/officeDocument/2006/customXml" ds:itemID="{AF9B4FB5-051B-45AD-A62D-48B3BC22D312}">
+  <ds:schemaRefs>
+    <ds:schemaRef ds:uri="http://schemas.openxmlformats.org/officeDocument/2006/bibliography"/>
+  </ds:schemaRefs>
+</ds:datastoreItem>
 </file>
</xml_diff>

<commit_message>
In office dose generation
</commit_message>
<xml_diff>
--- a/Working Documents/2026_COMPAAPM_Abstract.docx
+++ b/Working Documents/2026_COMPAAPM_Abstract.docx
@@ -27,412 +27,374 @@
     </w:p>
     <w:p>
       <w:r>
-        <w:t>Enter the Title of your abstract submission.</w:t>
+        <w:rPr>
+          <w:b/>
+          <w:bCs/>
+        </w:rPr>
+        <w:t>ABSTRACT</w:t>
+      </w:r>
+      <w:r>
+        <w:rPr>
+          <w:b/>
+          <w:bCs/>
+        </w:rPr>
+        <w:t xml:space="preserve"> (2</w:t>
+      </w:r>
+      <w:r>
+        <w:rPr>
+          <w:b/>
+          <w:bCs/>
+        </w:rPr>
+        <w:t>40</w:t>
+      </w:r>
+      <w:r>
+        <w:rPr>
+          <w:b/>
+          <w:bCs/>
+        </w:rPr>
+        <w:t>/300 words)</w:t>
       </w:r>
     </w:p>
     <w:p>
       <w:pPr>
-        <w:numPr>
-          <w:ilvl w:val="0"/>
-          <w:numId w:val="1"/>
-        </w:numPr>
-      </w:pPr>
-      <w:r>
-        <w:t>Use title case when entering your title. This will allow for consistency in formatting when published in the journal and online meeting program. </w:t>
+        <w:spacing w:line="276" w:lineRule="auto"/>
+      </w:pPr>
+      <w:r>
+        <w:rPr>
+          <w:b/>
+          <w:bCs/>
+        </w:rPr>
+        <w:t>Purpose:</w:t>
+      </w:r>
+      <w:r>
+        <w:rPr>
+          <w:b/>
+          <w:bCs/>
+        </w:rPr>
+        <w:t xml:space="preserve">  </w:t>
+      </w:r>
+      <w:r>
+        <w:t xml:space="preserve">Total body irradiation </w:t>
+      </w:r>
+      <w:r>
+        <w:t xml:space="preserve">(TBI) </w:t>
+      </w:r>
+      <w:r>
+        <w:t xml:space="preserve">requires the entirety of the patient's body to be irradiated, and treatment methods vary greatly across treatment centres. For many of these techniques, little is known about the heterogeneity of dose delivered to the circulating blood. </w:t>
+      </w:r>
+      <w:r>
+        <w:t xml:space="preserve">To assess the dose delivered to </w:t>
+      </w:r>
+      <w:r>
+        <w:t>the circulating blood volume</w:t>
+      </w:r>
+      <w:r>
+        <w:t xml:space="preserve"> </w:t>
+      </w:r>
+      <w:r>
+        <w:t xml:space="preserve">during Sweeping Cobalt-60 </w:t>
+      </w:r>
+      <w:r>
+        <w:t>(Co-60</w:t>
+      </w:r>
+      <w:r>
+        <w:t xml:space="preserve">) </w:t>
+      </w:r>
+      <w:r>
+        <w:t>TBI</w:t>
+      </w:r>
+      <w:r>
+        <w:t>, a full body blood flow simulation</w:t>
+      </w:r>
+      <w:r>
+        <w:t xml:space="preserve"> </w:t>
+      </w:r>
+      <w:r>
+        <w:t>was combined</w:t>
+      </w:r>
+      <w:r>
+        <w:t xml:space="preserve"> with</w:t>
+      </w:r>
+      <w:r>
+        <w:t xml:space="preserve"> </w:t>
+      </w:r>
+      <w:r>
+        <w:t>Monte Carlo generated 4D dose distributions.</w:t>
       </w:r>
     </w:p>
     <w:p>
       <w:pPr>
-        <w:numPr>
-          <w:ilvl w:val="1"/>
-          <w:numId w:val="1"/>
-        </w:numPr>
-      </w:pPr>
-      <w:hyperlink r:id="rId6" w:tgtFrame="_blank" w:history="1">
-        <w:r>
-          <w:rPr>
-            <w:rStyle w:val="Hyperlink"/>
-          </w:rPr>
-          <w:t>Title case converter</w:t>
-        </w:r>
-      </w:hyperlink>
-      <w:r>
-        <w:t>. (Open link, paste or type in words and select title case under convert.)</w:t>
+        <w:spacing w:line="276" w:lineRule="auto"/>
+      </w:pPr>
+      <w:r>
+        <w:rPr>
+          <w:b/>
+          <w:bCs/>
+        </w:rPr>
+        <w:br/>
+        <w:t>Methods:</w:t>
+      </w:r>
+      <w:r>
+        <w:rPr>
+          <w:b/>
+          <w:bCs/>
+        </w:rPr>
+        <w:t xml:space="preserve"> </w:t>
+      </w:r>
+      <w:r>
+        <w:t xml:space="preserve"> A virtual</w:t>
+      </w:r>
+      <w:r>
+        <w:t xml:space="preserve"> </w:t>
+      </w:r>
+      <w:r>
+        <w:t xml:space="preserve">phantom </w:t>
+      </w:r>
+      <w:r>
+        <w:t xml:space="preserve">was used to </w:t>
+      </w:r>
+      <w:r>
+        <w:t>create</w:t>
+      </w:r>
+      <w:r>
+        <w:t xml:space="preserve"> a </w:t>
+      </w:r>
+      <w:r>
+        <w:t xml:space="preserve">Monte Carlo phantom mimicking a </w:t>
+      </w:r>
+      <w:r>
+        <w:t>Co-60 TBI treatment set-up</w:t>
+      </w:r>
+      <w:r>
+        <w:t xml:space="preserve">. </w:t>
+      </w:r>
+      <w:r>
+        <w:t>T</w:t>
+      </w:r>
+      <w:r>
+        <w:t xml:space="preserve">ime-resolved Monte Carlo simulations using modified </w:t>
+      </w:r>
+      <w:proofErr w:type="spellStart"/>
+      <w:r>
+        <w:t>DOSXYZnrc</w:t>
+      </w:r>
+      <w:proofErr w:type="spellEnd"/>
+      <w:r>
+        <w:t xml:space="preserve">, </w:t>
+      </w:r>
+      <w:r>
+        <w:t>for</w:t>
+      </w:r>
+      <w:r>
+        <w:t xml:space="preserve"> </w:t>
+      </w:r>
+      <w:r>
+        <w:t>both supine and prone patient positions, were completed</w:t>
+      </w:r>
+      <w:r>
+        <w:t>.</w:t>
+      </w:r>
+      <w:r>
+        <w:t xml:space="preserve"> </w:t>
+      </w:r>
+      <w:r>
+        <w:t xml:space="preserve">The </w:t>
+      </w:r>
+      <w:r>
+        <w:t xml:space="preserve">virtual </w:t>
+      </w:r>
+      <w:r>
+        <w:t xml:space="preserve">phantom also enabled the </w:t>
+      </w:r>
+      <w:r>
+        <w:t>creat</w:t>
+      </w:r>
+      <w:r>
+        <w:t>ion of a</w:t>
+      </w:r>
+      <w:r>
+        <w:t xml:space="preserve"> blood flow model </w:t>
+      </w:r>
+      <w:r>
+        <w:t>which</w:t>
+      </w:r>
+      <w:r>
+        <w:t xml:space="preserve"> </w:t>
+      </w:r>
+      <w:proofErr w:type="spellStart"/>
+      <w:r>
+        <w:t>spatio</w:t>
+      </w:r>
+      <w:proofErr w:type="spellEnd"/>
+      <w:r>
+        <w:t>-temporally</w:t>
+      </w:r>
+      <w:r>
+        <w:t xml:space="preserve"> </w:t>
+      </w:r>
+      <w:r>
+        <w:t>track</w:t>
+      </w:r>
+      <w:r>
+        <w:t xml:space="preserve"> blood volumes (BVs)</w:t>
+      </w:r>
+      <w:r>
+        <w:t xml:space="preserve"> through the phanto</w:t>
+      </w:r>
+      <w:r>
+        <w:t>m</w:t>
+      </w:r>
+      <w:r>
+        <w:t>.</w:t>
+      </w:r>
+      <w:r>
+        <w:t xml:space="preserve"> </w:t>
+      </w:r>
+      <w:r>
+        <w:t xml:space="preserve">The model is composed of 94 vessel segments and 28 compartments.  </w:t>
+      </w:r>
+      <w:r>
+        <w:t>BV trajectories were determined using one-dimensional blood flow modeling, in-vivo data</w:t>
+      </w:r>
+      <w:r>
+        <w:t>,</w:t>
+      </w:r>
+      <w:r>
+        <w:t xml:space="preserve"> and </w:t>
+      </w:r>
+      <w:r>
+        <w:t>zero-dimensional compartments</w:t>
+      </w:r>
+      <w:r>
+        <w:t xml:space="preserve">. </w:t>
+      </w:r>
+      <w:r>
+        <w:t>The</w:t>
+      </w:r>
+      <w:r>
+        <w:t xml:space="preserve"> 4D</w:t>
+      </w:r>
+      <w:r>
+        <w:t xml:space="preserve"> dose </w:t>
+      </w:r>
+      <w:r>
+        <w:t xml:space="preserve">distributions </w:t>
+      </w:r>
+      <w:r>
+        <w:t>w</w:t>
+      </w:r>
+      <w:r>
+        <w:t>ere</w:t>
+      </w:r>
+      <w:r>
+        <w:t xml:space="preserve"> sampled </w:t>
+      </w:r>
+      <w:r>
+        <w:t xml:space="preserve">as </w:t>
+      </w:r>
+      <w:r>
+        <w:t>the</w:t>
+      </w:r>
+      <w:r>
+        <w:t xml:space="preserve"> BVs moved through the </w:t>
+      </w:r>
+      <w:r>
+        <w:t>flow model</w:t>
+      </w:r>
+      <w:r>
+        <w:t>.</w:t>
+      </w:r>
+      <w:r>
+        <w:t xml:space="preserve"> For a 12 Gy prescription, in 6 fractions with two patient positions each, the dose to the circulating blood was determined for a single fraction and the entire treatment.</w:t>
       </w:r>
     </w:p>
     <w:p>
+      <w:pPr>
+        <w:spacing w:line="276" w:lineRule="auto"/>
+      </w:pPr>
       <w:r>
         <w:rPr>
           <w:b/>
           <w:bCs/>
         </w:rPr>
-        <w:t>ABSTRACT</w:t>
+        <w:t>Results</w:t>
       </w:r>
       <w:r>
         <w:rPr>
           <w:b/>
           <w:bCs/>
         </w:rPr>
-        <w:t xml:space="preserve"> (2</w:t>
-      </w:r>
+        <w:t>:</w:t>
+      </w:r>
+      <w:r>
+        <w:t xml:space="preserve"> The circulating blood received </w:t>
+      </w:r>
+      <w:r>
+        <w:t>0.66</w:t>
+      </w:r>
+      <w:r>
+        <w:t xml:space="preserve"> </w:t>
+      </w:r>
+      <w:r>
+        <w:t xml:space="preserve">± 0.05 Gy </w:t>
+      </w:r>
+      <w:r>
+        <w:t>in one fraction</w:t>
+      </w:r>
+      <w:r>
+        <w:t xml:space="preserve"> and</w:t>
+      </w:r>
+      <w:r>
+        <w:t xml:space="preserve"> </w:t>
+      </w:r>
+      <w:r>
+        <w:t xml:space="preserve">± Gy </w:t>
+      </w:r>
+      <w:r>
+        <w:t xml:space="preserve">after all fractions. </w:t>
+      </w:r>
+    </w:p>
+    <w:p>
+      <w:pPr>
+        <w:spacing w:line="276" w:lineRule="auto"/>
+      </w:pPr>
       <w:r>
         <w:rPr>
           <w:b/>
           <w:bCs/>
         </w:rPr>
-        <w:t>5</w:t>
+        <w:t>Conclusion:</w:t>
       </w:r>
       <w:r>
         <w:rPr>
           <w:b/>
           <w:bCs/>
         </w:rPr>
-        <w:t>8</w:t>
-      </w:r>
-      <w:r>
-        <w:rPr>
-          <w:b/>
-          <w:bCs/>
-        </w:rPr>
-        <w:t>/300 words)</w:t>
-      </w:r>
-    </w:p>
-    <w:p>
-      <w:r>
-        <w:rPr>
-          <w:b/>
-          <w:bCs/>
-        </w:rPr>
-        <w:t>Purpose:</w:t>
-      </w:r>
-      <w:r>
-        <w:rPr>
-          <w:b/>
-          <w:bCs/>
-        </w:rPr>
-        <w:t xml:space="preserve">  </w:t>
-      </w:r>
-      <w:r>
-        <w:t xml:space="preserve">Total body irradiation requires the entirety of the patient's body to be irradiated, and treatment methods vary greatly across treatment centres. For many of these techniques, little is known about the heterogeneity of dose delivered to the circulating blood. </w:t>
-      </w:r>
-      <w:r>
-        <w:t xml:space="preserve">To assess the dose delivered to </w:t>
-      </w:r>
-      <w:r>
-        <w:t>the circulating blood volume</w:t>
-      </w:r>
-      <w:r>
-        <w:t>s (BVs)</w:t>
-      </w:r>
-      <w:r>
-        <w:t xml:space="preserve"> during Sweeping Cobalt-60 </w:t>
-      </w:r>
-      <w:r>
-        <w:t xml:space="preserve">(Co-60) </w:t>
-      </w:r>
-      <w:r>
-        <w:t xml:space="preserve">Total Body Irradiation </w:t>
-      </w:r>
-      <w:r>
-        <w:t>(TBI</w:t>
-      </w:r>
-      <w:r>
-        <w:t>)</w:t>
-      </w:r>
-      <w:r>
-        <w:t>, a full body blood flow simulation</w:t>
-      </w:r>
-      <w:r>
         <w:t xml:space="preserve"> </w:t>
       </w:r>
       <w:r>
-        <w:t>was combined with 4-dimensional Monte Carlo (4DMC)</w:t>
-      </w:r>
-      <w:r>
-        <w:t xml:space="preserve"> simulation</w:t>
-      </w:r>
-      <w:r>
-        <w:t>s</w:t>
-      </w:r>
-      <w:r>
-        <w:t>.</w:t>
-      </w:r>
-    </w:p>
-    <w:p>
-      <w:r>
-        <w:t xml:space="preserve"> </w:t>
-      </w:r>
-      <w:r>
-        <w:rPr>
-          <w:highlight w:val="lightGray"/>
-        </w:rPr>
-        <w:t>Additionally</w:t>
-      </w:r>
-      <w:r>
-        <w:rPr>
-          <w:highlight w:val="lightGray"/>
-        </w:rPr>
-        <w:t xml:space="preserve"> maximum and minimum dose to the blood and the dose rate to the lungs was determined as they are clinically relevant parameters.</w:t>
-      </w:r>
-    </w:p>
-    <w:p>
-      <w:r>
-        <w:rPr>
-          <w:b/>
-          <w:bCs/>
-        </w:rPr>
-        <w:br/>
-        <w:t>Methods:</w:t>
-      </w:r>
-      <w:r>
-        <w:rPr>
-          <w:b/>
-          <w:bCs/>
-        </w:rPr>
-        <w:t xml:space="preserve"> </w:t>
-      </w:r>
-      <w:r>
-        <w:t xml:space="preserve"> A virtual phantom </w:t>
-      </w:r>
-      <w:r>
-        <w:t>was used to replicate a Co-60 TBI treatment set-up</w:t>
-      </w:r>
-      <w:r>
-        <w:t xml:space="preserve"> for </w:t>
-      </w:r>
-      <w:proofErr w:type="spellStart"/>
-      <w:r>
-        <w:t>EGSnrc</w:t>
-      </w:r>
-      <w:proofErr w:type="spellEnd"/>
-      <w:r>
-        <w:t xml:space="preserve"> MC simulations</w:t>
+        <w:t>A whole-body blood flow</w:t>
+      </w:r>
+      <w:r>
+        <w:t xml:space="preserve"> model </w:t>
+      </w:r>
+      <w:r>
+        <w:t xml:space="preserve">was paired with </w:t>
+      </w:r>
+      <w:r>
+        <w:t xml:space="preserve">4D dose distributions to assess </w:t>
+      </w:r>
+      <w:r>
+        <w:t>the heterogeneity of the dose to the circulating blood</w:t>
+      </w:r>
+      <w:r>
+        <w:t xml:space="preserve"> achieved by</w:t>
+      </w:r>
+      <w:r>
+        <w:t xml:space="preserve"> sweeping Co-60 TBI</w:t>
       </w:r>
       <w:r>
         <w:t xml:space="preserve">. </w:t>
-      </w:r>
-      <w:r>
-        <w:t xml:space="preserve"> </w:t>
-      </w:r>
-      <w:r>
-        <w:t>T</w:t>
-      </w:r>
-      <w:r>
-        <w:t xml:space="preserve">ime-resolved Monte Carlo simulations using in-house modified </w:t>
-      </w:r>
-      <w:proofErr w:type="spellStart"/>
-      <w:r>
-        <w:t>DOSXYZnrc</w:t>
-      </w:r>
-      <w:proofErr w:type="spellEnd"/>
-      <w:r>
-        <w:t>, referred to as 4DMC</w:t>
-      </w:r>
-      <w:r>
-        <w:t>,</w:t>
-      </w:r>
-      <w:r>
-        <w:t xml:space="preserve"> for</w:t>
-      </w:r>
-      <w:r>
-        <w:t xml:space="preserve"> </w:t>
-      </w:r>
-      <w:r>
-        <w:t xml:space="preserve">a </w:t>
-      </w:r>
-      <w:r>
-        <w:t>single fraction w</w:t>
-      </w:r>
-      <w:r>
-        <w:t xml:space="preserve">ere </w:t>
-      </w:r>
-      <w:r>
-        <w:t>completed</w:t>
-      </w:r>
-      <w:r>
-        <w:t>.</w:t>
-      </w:r>
-      <w:r>
-        <w:t xml:space="preserve"> </w:t>
-      </w:r>
-      <w:r>
-        <w:t xml:space="preserve">The phantom also enabled the </w:t>
-      </w:r>
-      <w:r>
-        <w:t>creat</w:t>
-      </w:r>
-      <w:r>
-        <w:t>ion of a</w:t>
-      </w:r>
-      <w:r>
-        <w:t xml:space="preserve"> blood flow model </w:t>
-      </w:r>
-      <w:r>
-        <w:t>to</w:t>
-      </w:r>
-      <w:r>
-        <w:t xml:space="preserve"> </w:t>
-      </w:r>
-      <w:proofErr w:type="spellStart"/>
-      <w:r>
-        <w:t>spatio</w:t>
-      </w:r>
-      <w:proofErr w:type="spellEnd"/>
-      <w:r>
-        <w:t>-temporally</w:t>
-      </w:r>
-      <w:r>
-        <w:t xml:space="preserve"> </w:t>
-      </w:r>
-      <w:r>
-        <w:t xml:space="preserve">track </w:t>
-      </w:r>
-      <w:r>
-        <w:t>BVs throughout the phanto</w:t>
-      </w:r>
-      <w:r>
-        <w:t>m</w:t>
-      </w:r>
-      <w:r>
-        <w:t>.</w:t>
-      </w:r>
-      <w:r>
-        <w:t xml:space="preserve"> </w:t>
-      </w:r>
-      <w:r>
-        <w:t xml:space="preserve">The model is composed of 94 vessel segments and 28 compartments.  </w:t>
-      </w:r>
-      <w:r>
-        <w:t>BV trajectories were determined using one-dimensional blood flow modeling, in-vivo data</w:t>
-      </w:r>
-      <w:r>
-        <w:t>,</w:t>
-      </w:r>
-      <w:r>
-        <w:t xml:space="preserve"> and </w:t>
-      </w:r>
-      <w:r>
-        <w:t>zero-dimensional compartments</w:t>
-      </w:r>
-      <w:r>
-        <w:t xml:space="preserve">. </w:t>
-      </w:r>
-      <w:r>
-        <w:t>The dose data from the 4DMC simulation</w:t>
-      </w:r>
-      <w:r>
-        <w:t>s</w:t>
-      </w:r>
-      <w:r>
-        <w:t xml:space="preserve"> w</w:t>
-      </w:r>
-      <w:r>
-        <w:t>ere</w:t>
-      </w:r>
-      <w:r>
-        <w:t xml:space="preserve"> sampled </w:t>
-      </w:r>
-      <w:r>
-        <w:t xml:space="preserve">as </w:t>
-      </w:r>
-      <w:r>
-        <w:t>1E5</w:t>
-      </w:r>
-      <w:r>
-        <w:t xml:space="preserve"> BVs moved through the </w:t>
-      </w:r>
-      <w:r>
-        <w:t xml:space="preserve">flow model with a time resolution of 2 </w:t>
-      </w:r>
-      <w:proofErr w:type="spellStart"/>
-      <w:r>
-        <w:t>ms</w:t>
-      </w:r>
-      <w:proofErr w:type="spellEnd"/>
-      <w:r>
-        <w:t xml:space="preserve"> to determine the dose to the BVs. </w:t>
-      </w:r>
-    </w:p>
-    <w:p>
-      <w:r>
-        <w:rPr>
-          <w:b/>
-          <w:bCs/>
-        </w:rPr>
-        <w:t>Results</w:t>
-      </w:r>
-      <w:r>
-        <w:rPr>
-          <w:b/>
-          <w:bCs/>
-        </w:rPr>
-        <w:t>:</w:t>
-      </w:r>
-      <w:r>
-        <w:t xml:space="preserve"> The circulating blood received </w:t>
-      </w:r>
-      <w:r>
-        <w:t># +- # %</w:t>
-      </w:r>
-      <w:r>
-        <w:t xml:space="preserve"> in one fraction</w:t>
-      </w:r>
-      <w:r>
-        <w:t>.</w:t>
-      </w:r>
-      <w:r>
-        <w:t xml:space="preserve"> The integration of motion </w:t>
-      </w:r>
-      <w:r>
-        <w:rPr>
-          <w:highlight w:val="lightGray"/>
-        </w:rPr>
-        <w:t>results of comparting static to moving</w:t>
-      </w:r>
-      <w:r>
-        <w:t>.</w:t>
-      </w:r>
-      <w:r>
-        <w:t xml:space="preserve"> The </w:t>
-      </w:r>
-    </w:p>
-    <w:p>
-      <w:r>
-        <w:rPr>
-          <w:b/>
-          <w:bCs/>
-        </w:rPr>
-        <w:t>Conclusion:</w:t>
-      </w:r>
-      <w:r>
-        <w:rPr>
-          <w:b/>
-          <w:bCs/>
-        </w:rPr>
-        <w:t xml:space="preserve"> </w:t>
-      </w:r>
-      <w:r>
-        <w:t>A novel whole-body blood flow</w:t>
-      </w:r>
-      <w:r>
-        <w:t xml:space="preserve"> model </w:t>
-      </w:r>
-      <w:r>
-        <w:t xml:space="preserve">was paired with 4DMC simulation of sweeping Co-60 TBI to </w:t>
-      </w:r>
-      <w:r>
-        <w:t xml:space="preserve">assess the heterogeneity of the dose to the circulating blood. </w:t>
-      </w:r>
-    </w:p>
-    <w:p>
-      <w:pPr>
-        <w:numPr>
-          <w:ilvl w:val="0"/>
-          <w:numId w:val="3"/>
-        </w:numPr>
-      </w:pPr>
-      <w:r>
-        <w:t>Abstracts must NOT exceed 300 words.</w:t>
       </w:r>
     </w:p>
     <w:p/>
@@ -452,6 +414,13 @@
       </w:r>
     </w:p>
     <w:p/>
+    <w:p/>
+    <w:p/>
+    <w:p/>
+    <w:p/>
+    <w:p/>
+    <w:p/>
+    <w:p/>
     <w:p>
       <w:r>
         <w:rPr>
@@ -459,7 +428,6 @@
           <w:bCs/>
           <w:u w:val="single"/>
         </w:rPr>
-        <w:lastRenderedPageBreak/>
         <w:t>SUPPORTING DOCUMENT</w:t>
       </w:r>
     </w:p>
@@ -644,7 +612,7 @@
       <w:r>
         <w:t>Preferred format is illustrated in the </w:t>
       </w:r>
-      <w:hyperlink r:id="rId7" w:history="1">
+      <w:hyperlink r:id="rId6" w:history="1">
         <w:r>
           <w:rPr>
             <w:rStyle w:val="Hyperlink"/>
@@ -713,7 +681,6 @@
           <w:b/>
           <w:bCs/>
         </w:rPr>
-        <w:lastRenderedPageBreak/>
         <w:t xml:space="preserve">Innovation/Impact: </w:t>
       </w:r>
       <w:r>
@@ -916,7 +883,19 @@
         <w:rPr>
           <w:rFonts w:ascii="Arial" w:hAnsi="Arial" w:cs="Arial"/>
         </w:rPr>
-        <w:t xml:space="preserve"> 12 Gy over 6 fractions. The resulting heterogeneity after one fraction </w:t>
+        <w:t xml:space="preserve"> 12 Gy over 6 fractions. The resulting </w:t>
+      </w:r>
+      <w:r>
+        <w:rPr>
+          <w:rFonts w:ascii="Arial" w:hAnsi="Arial" w:cs="Arial"/>
+        </w:rPr>
+        <w:t>dose</w:t>
+      </w:r>
+      <w:r>
+        <w:rPr>
+          <w:rFonts w:ascii="Arial" w:hAnsi="Arial" w:cs="Arial"/>
+        </w:rPr>
+        <w:t xml:space="preserve"> after one fraction </w:t>
       </w:r>
       <w:r>
         <w:rPr>
@@ -968,7 +947,7 @@
                           <pic:cNvPicPr/>
                         </pic:nvPicPr>
                         <pic:blipFill>
-                          <a:blip r:embed="rId8"/>
+                          <a:blip r:embed="rId7"/>
                           <a:stretch>
                             <a:fillRect/>
                           </a:stretch>
@@ -1007,7 +986,7 @@
                 <w:noProof/>
               </w:rPr>
               <w:drawing>
-                <wp:anchor distT="0" distB="0" distL="114300" distR="114300" simplePos="0" relativeHeight="251658240" behindDoc="1" locked="0" layoutInCell="1" allowOverlap="1" wp14:anchorId="4517F4EA" wp14:editId="0604A29B">
+                <wp:anchor distT="0" distB="0" distL="114300" distR="114300" simplePos="0" relativeHeight="251658240" behindDoc="1" locked="0" layoutInCell="1" allowOverlap="1" wp14:anchorId="4517F4EA" wp14:editId="51B6278B">
                   <wp:simplePos x="0" y="0"/>
                   <wp:positionH relativeFrom="column">
                     <wp:posOffset>17618</wp:posOffset>
@@ -1038,7 +1017,7 @@
                           <pic:cNvPicPr/>
                         </pic:nvPicPr>
                         <pic:blipFill>
-                          <a:blip r:embed="rId9" cstate="print">
+                          <a:blip r:embed="rId8" cstate="print">
                             <a:extLst>
                               <a:ext uri="{28A0092B-C50C-407E-A947-70E740481C1C}">
                                 <a14:useLocalDpi xmlns:a14="http://schemas.microsoft.com/office/drawing/2010/main" val="0"/>
@@ -1169,6 +1148,7 @@
             <w:r>
               <w:rPr>
                 <w:rFonts w:ascii="Arial" w:hAnsi="Arial" w:cs="Arial"/>
+                <w:noProof/>
               </w:rPr>
               <w:drawing>
                 <wp:anchor distT="0" distB="0" distL="114300" distR="114300" simplePos="0" relativeHeight="251659264" behindDoc="1" locked="0" layoutInCell="1" allowOverlap="1" wp14:anchorId="55B1BC97" wp14:editId="0BE25C89">
@@ -1208,7 +1188,7 @@
                           </pic:cNvPicPr>
                         </pic:nvPicPr>
                         <pic:blipFill>
-                          <a:blip r:embed="rId10" cstate="print">
+                          <a:blip r:embed="rId9" cstate="print">
                             <a:extLst>
                               <a:ext uri="{28A0092B-C50C-407E-A947-70E740481C1C}">
                                 <a14:useLocalDpi xmlns:a14="http://schemas.microsoft.com/office/drawing/2010/main" val="0"/>
@@ -1266,7 +1246,9 @@
               <w:jc w:val="center"/>
             </w:pPr>
             <w:r>
-              <w:lastRenderedPageBreak/>
+              <w:rPr>
+                <w:noProof/>
+              </w:rPr>
               <w:drawing>
                 <wp:inline distT="0" distB="0" distL="0" distR="0" wp14:anchorId="22C71597" wp14:editId="027B70A8">
                   <wp:extent cx="3959149" cy="2583711"/>
@@ -1283,7 +1265,7 @@
                           <pic:cNvPicPr/>
                         </pic:nvPicPr>
                         <pic:blipFill>
-                          <a:blip r:embed="rId11"/>
+                          <a:blip r:embed="rId10"/>
                           <a:stretch>
                             <a:fillRect/>
                           </a:stretch>
@@ -1315,6 +1297,9 @@
               <w:jc w:val="center"/>
             </w:pPr>
             <w:r>
+              <w:rPr>
+                <w:noProof/>
+              </w:rPr>
               <w:drawing>
                 <wp:inline distT="0" distB="0" distL="0" distR="0" wp14:anchorId="2FD6C023" wp14:editId="262720A1">
                   <wp:extent cx="2775508" cy="3413051"/>
@@ -1331,7 +1316,7 @@
                           <pic:cNvPicPr/>
                         </pic:nvPicPr>
                         <pic:blipFill>
-                          <a:blip r:embed="rId12"/>
+                          <a:blip r:embed="rId11"/>
                           <a:stretch>
                             <a:fillRect/>
                           </a:stretch>
@@ -1750,7 +1735,57 @@
             <w:tcW w:w="10790" w:type="dxa"/>
             <w:gridSpan w:val="2"/>
           </w:tcPr>
-          <w:p/>
+          <w:p>
+            <w:pPr>
+              <w:jc w:val="center"/>
+            </w:pPr>
+            <w:r>
+              <w:rPr>
+                <w:noProof/>
+              </w:rPr>
+              <w:drawing>
+                <wp:inline distT="0" distB="0" distL="0" distR="0" wp14:anchorId="0FB0C17A" wp14:editId="1E1E37AC">
+                  <wp:extent cx="4495505" cy="3203759"/>
+                  <wp:effectExtent l="0" t="0" r="635" b="0"/>
+                  <wp:docPr id="1594593205" name="Picture 1"/>
+                  <wp:cNvGraphicFramePr>
+                    <a:graphicFrameLocks xmlns:a="http://schemas.openxmlformats.org/drawingml/2006/main" noChangeAspect="1"/>
+                  </wp:cNvGraphicFramePr>
+                  <a:graphic xmlns:a="http://schemas.openxmlformats.org/drawingml/2006/main">
+                    <a:graphicData uri="http://schemas.openxmlformats.org/drawingml/2006/picture">
+                      <pic:pic xmlns:pic="http://schemas.openxmlformats.org/drawingml/2006/picture">
+                        <pic:nvPicPr>
+                          <pic:cNvPr id="1594593205" name=""/>
+                          <pic:cNvPicPr/>
+                        </pic:nvPicPr>
+                        <pic:blipFill>
+                          <a:blip r:embed="rId12"/>
+                          <a:stretch>
+                            <a:fillRect/>
+                          </a:stretch>
+                        </pic:blipFill>
+                        <pic:spPr>
+                          <a:xfrm>
+                            <a:off x="0" y="0"/>
+                            <a:ext cx="4514036" cy="3216966"/>
+                          </a:xfrm>
+                          <a:prstGeom prst="rect">
+                            <a:avLst/>
+                          </a:prstGeom>
+                        </pic:spPr>
+                      </pic:pic>
+                    </a:graphicData>
+                  </a:graphic>
+                </wp:inline>
+              </w:drawing>
+            </w:r>
+            <w:r>
+              <w:rPr>
+                <w:highlight w:val="yellow"/>
+              </w:rPr>
+              <w:t>TEMP</w:t>
+            </w:r>
+          </w:p>
         </w:tc>
       </w:tr>
       <w:tr>
@@ -1759,12 +1794,17 @@
             <w:tcW w:w="10790" w:type="dxa"/>
             <w:gridSpan w:val="2"/>
           </w:tcPr>
-          <w:p/>
+          <w:p>
+            <w:r>
+              <w:t>Figure 6: Dose to circulating blood volume for a single fraction () and the entire treatment plan ().</w:t>
+            </w:r>
+          </w:p>
         </w:tc>
       </w:tr>
     </w:tbl>
     <w:p>
       <w:r>
+        <w:lastRenderedPageBreak/>
         <w:t xml:space="preserve">[1] </w:t>
       </w:r>
       <w:r>
@@ -1778,10 +1818,7 @@
         <w:t>Phys Med Biol</w:t>
       </w:r>
       <w:r>
-        <w:t>. 2021;66(16):164001</w:t>
-      </w:r>
-      <w:r>
-        <w:t xml:space="preserve"> </w:t>
+        <w:t xml:space="preserve">. 2021;66(16):164001 </w:t>
       </w:r>
     </w:p>
     <w:p/>
@@ -1790,7 +1827,6 @@
         <w:rPr>
           <w:noProof/>
         </w:rPr>
-        <w:lastRenderedPageBreak/>
         <w:drawing>
           <wp:inline distT="0" distB="0" distL="0" distR="0" wp14:anchorId="6F9F5381" wp14:editId="037EA3AC">
             <wp:extent cx="5943600" cy="7647940"/>
@@ -3778,6 +3814,7 @@
   <w:style w:type="character" w:default="1" w:styleId="DefaultParagraphFont">
     <w:name w:val="Default Paragraph Font"/>
     <w:uiPriority w:val="1"/>
+    <w:semiHidden/>
     <w:unhideWhenUsed/>
   </w:style>
   <w:style w:type="table" w:default="1" w:styleId="TableNormal">

</xml_diff>